<commit_message>
Final copy, Volume 1
Corrected index and table of contents.
</commit_message>
<xml_diff>
--- a/9Tap_first_revision_merge.docx
+++ b/9Tap_first_revision_merge.docx
@@ -37,8 +37,12 @@
       <w:pPr>
         <w:pStyle w:val="TitleCover"/>
         <w:sectPr>
-          <w:footerReference w:type="default" r:id="rId8"/>
-          <w:headerReference w:type="first" r:id="rId9"/>
+          <w:headerReference w:type="even" r:id="rId8"/>
+          <w:headerReference w:type="default" r:id="rId9"/>
+          <w:footerReference w:type="even" r:id="rId10"/>
+          <w:footerReference w:type="default" r:id="rId11"/>
+          <w:headerReference w:type="first" r:id="rId12"/>
+          <w:footerReference w:type="first" r:id="rId13"/>
           <w:pgSz w:w="12240" w:h="15840" w:code="1"/>
           <w:pgMar w:top="960" w:right="960" w:bottom="1440" w:left="960" w:header="0" w:footer="0" w:gutter="0"/>
           <w:pgNumType w:start="0"/>
@@ -120,7 +124,7 @@
     <w:p>
       <w:pPr>
         <w:sectPr>
-          <w:footerReference w:type="first" r:id="rId10"/>
+          <w:footerReference w:type="first" r:id="rId14"/>
           <w:pgSz w:w="12240" w:h="15840" w:code="1"/>
           <w:pgMar w:top="1800" w:right="1200" w:bottom="1440" w:left="1200" w:header="960" w:footer="960" w:gutter="0"/>
           <w:pgNumType w:fmt="lowerRoman" w:start="1"/>
@@ -214,110 +218,63 @@
           <w:r>
             <w:fldChar w:fldCharType="separate"/>
           </w:r>
-          <w:bookmarkStart w:id="0" w:name="_GoBack"/>
-          <w:bookmarkEnd w:id="0"/>
-          <w:r>
-            <w:rPr>
-              <w:rStyle w:val="Hyperlink"/>
-              <w:noProof/>
-            </w:rPr>
-            <w:fldChar w:fldCharType="begin"/>
-          </w:r>
-          <w:r>
-            <w:rPr>
-              <w:rStyle w:val="Hyperlink"/>
-              <w:noProof/>
-            </w:rPr>
-            <w:instrText xml:space="preserve"> </w:instrText>
-          </w:r>
-          <w:r>
-            <w:rPr>
-              <w:noProof/>
-            </w:rPr>
-            <w:instrText>HYPERLINK \l "_Toc509239575"</w:instrText>
-          </w:r>
-          <w:r>
-            <w:rPr>
-              <w:rStyle w:val="Hyperlink"/>
-              <w:noProof/>
-            </w:rPr>
-            <w:instrText xml:space="preserve"> </w:instrText>
-          </w:r>
-          <w:r>
-            <w:rPr>
-              <w:rStyle w:val="Hyperlink"/>
-              <w:noProof/>
-            </w:rPr>
-          </w:r>
-          <w:r>
-            <w:rPr>
-              <w:rStyle w:val="Hyperlink"/>
-              <w:noProof/>
-            </w:rPr>
-            <w:fldChar w:fldCharType="separate"/>
-          </w:r>
-          <w:r>
-            <w:rPr>
-              <w:rStyle w:val="Hyperlink"/>
-              <w:noProof/>
-            </w:rPr>
-            <w:t>About 9-Tap Tour INC</w:t>
-          </w:r>
-          <w:r>
-            <w:rPr>
-              <w:noProof/>
-              <w:webHidden/>
-            </w:rPr>
-            <w:tab/>
-          </w:r>
-          <w:r>
-            <w:rPr>
-              <w:noProof/>
-              <w:webHidden/>
-            </w:rPr>
-            <w:fldChar w:fldCharType="begin"/>
-          </w:r>
-          <w:r>
-            <w:rPr>
-              <w:noProof/>
-              <w:webHidden/>
-            </w:rPr>
-            <w:instrText xml:space="preserve"> PAGEREF _Toc509239575 \h </w:instrText>
-          </w:r>
-          <w:r>
-            <w:rPr>
-              <w:noProof/>
-              <w:webHidden/>
-            </w:rPr>
-          </w:r>
-          <w:r>
-            <w:rPr>
-              <w:noProof/>
-              <w:webHidden/>
-            </w:rPr>
-            <w:fldChar w:fldCharType="separate"/>
-          </w:r>
-          <w:r>
-            <w:rPr>
-              <w:noProof/>
-              <w:webHidden/>
-            </w:rPr>
-            <w:t>4</w:t>
-          </w:r>
-          <w:r>
-            <w:rPr>
-              <w:noProof/>
-              <w:webHidden/>
-            </w:rPr>
-            <w:fldChar w:fldCharType="end"/>
-          </w:r>
-          <w:r>
-            <w:rPr>
-              <w:rStyle w:val="Hyperlink"/>
-              <w:noProof/>
-            </w:rPr>
-            <w:fldChar w:fldCharType="end"/>
-          </w:r>
+          <w:hyperlink w:anchor="_Toc509239575" w:history="1">
+            <w:r>
+              <w:rPr>
+                <w:rStyle w:val="Hyperlink"/>
+                <w:noProof/>
+              </w:rPr>
+              <w:t>About 9-Tap Tour INC</w:t>
+            </w:r>
+            <w:r>
+              <w:rPr>
+                <w:noProof/>
+                <w:webHidden/>
+              </w:rPr>
+              <w:tab/>
+            </w:r>
+            <w:r>
+              <w:rPr>
+                <w:noProof/>
+                <w:webHidden/>
+              </w:rPr>
+              <w:fldChar w:fldCharType="begin"/>
+            </w:r>
+            <w:r>
+              <w:rPr>
+                <w:noProof/>
+                <w:webHidden/>
+              </w:rPr>
+              <w:instrText xml:space="preserve"> PAGEREF _Toc509239575 \h </w:instrText>
+            </w:r>
+            <w:r>
+              <w:rPr>
+                <w:noProof/>
+                <w:webHidden/>
+              </w:rPr>
+            </w:r>
+            <w:r>
+              <w:rPr>
+                <w:noProof/>
+                <w:webHidden/>
+              </w:rPr>
+              <w:fldChar w:fldCharType="separate"/>
+            </w:r>
+            <w:r>
+              <w:rPr>
+                <w:noProof/>
+                <w:webHidden/>
+              </w:rPr>
+              <w:t>4</w:t>
+            </w:r>
+            <w:r>
+              <w:rPr>
+                <w:noProof/>
+                <w:webHidden/>
+              </w:rPr>
+              <w:fldChar w:fldCharType="end"/>
+            </w:r>
+          </w:hyperlink>
         </w:p>
         <w:p>
           <w:pPr>
@@ -3999,8 +3956,8 @@
           <w:kern w:val="28"/>
         </w:rPr>
         <w:sectPr>
-          <w:headerReference w:type="default" r:id="rId11"/>
-          <w:footerReference w:type="default" r:id="rId12"/>
+          <w:headerReference w:type="default" r:id="rId15"/>
+          <w:footerReference w:type="default" r:id="rId16"/>
           <w:type w:val="continuous"/>
           <w:pgSz w:w="12240" w:h="15840" w:code="1"/>
           <w:pgMar w:top="1800" w:right="2040" w:bottom="1440" w:left="2280" w:header="960" w:footer="960" w:gutter="0"/>
@@ -4068,7 +4025,7 @@
       <w:pPr>
         <w:pStyle w:val="Heading1"/>
       </w:pPr>
-      <w:bookmarkStart w:id="1" w:name="_Toc509239575"/>
+      <w:bookmarkStart w:id="0" w:name="_Toc509239575"/>
       <w:r>
         <w:lastRenderedPageBreak/>
         <w:t>About</w:t>
@@ -4091,7 +4048,7 @@
       <w:r>
         <w:t xml:space="preserve"> 9-Tap Tour INC</w:t>
       </w:r>
-      <w:bookmarkEnd w:id="1"/>
+      <w:bookmarkEnd w:id="0"/>
     </w:p>
     <w:p>
       <w:pPr>
@@ -4266,8 +4223,8 @@
           <w:szCs w:val="20"/>
         </w:rPr>
       </w:pPr>
-      <w:bookmarkStart w:id="2" w:name="_Toc508882989"/>
-      <w:bookmarkStart w:id="3" w:name="_Toc509239576"/>
+      <w:bookmarkStart w:id="1" w:name="_Toc508882989"/>
+      <w:bookmarkStart w:id="2" w:name="_Toc509239576"/>
       <w:r>
         <w:rPr>
           <w:szCs w:val="20"/>
@@ -4275,8 +4232,8 @@
         <w:lastRenderedPageBreak/>
         <w:t>Dedication:</w:t>
       </w:r>
+      <w:bookmarkEnd w:id="1"/>
       <w:bookmarkEnd w:id="2"/>
-      <w:bookmarkEnd w:id="3"/>
     </w:p>
     <w:p>
       <w:pPr>
@@ -4286,15 +4243,7 @@
         <w:t>To the students of Clover Park Technical College’s Computer Programing program. Thank you for all your hard work on this project.</w:t>
       </w:r>
       <w:r>
-        <w:t xml:space="preserve"> Thank you Dr. </w:t>
-      </w:r>
-      <w:proofErr w:type="spellStart"/>
-      <w:r>
-        <w:t>Meerdink</w:t>
-      </w:r>
-      <w:proofErr w:type="spellEnd"/>
-      <w:r>
-        <w:t xml:space="preserve"> for putting up with us.</w:t>
+        <w:t xml:space="preserve"> Thank you Dr. Meerdink for putting up with us.</w:t>
       </w:r>
     </w:p>
     <w:p>
@@ -4305,7 +4254,7 @@
           <w:szCs w:val="40"/>
         </w:rPr>
         <w:sectPr>
-          <w:footerReference w:type="default" r:id="rId13"/>
+          <w:footerReference w:type="default" r:id="rId17"/>
           <w:type w:val="continuous"/>
           <w:pgSz w:w="12240" w:h="15840" w:code="1"/>
           <w:pgMar w:top="1800" w:right="1195" w:bottom="1440" w:left="3355" w:header="965" w:footer="965" w:gutter="0"/>
@@ -4322,7 +4271,7 @@
           <w:szCs w:val="40"/>
         </w:rPr>
       </w:pPr>
-      <w:bookmarkStart w:id="4" w:name="_Toc509239577"/>
+      <w:bookmarkStart w:id="3" w:name="_Toc509239577"/>
       <w:r>
         <w:rPr>
           <w:sz w:val="40"/>
@@ -4330,7 +4279,7 @@
         </w:rPr>
         <w:t>What is 9-Tap?</w:t>
       </w:r>
-      <w:bookmarkEnd w:id="4"/>
+      <w:bookmarkEnd w:id="3"/>
     </w:p>
     <w:p>
       <w:pPr>
@@ -4365,7 +4314,7 @@
                     <pic:cNvPicPr/>
                   </pic:nvPicPr>
                   <pic:blipFill>
-                    <a:blip r:embed="rId14" cstate="print">
+                    <a:blip r:embed="rId18" cstate="print">
                       <a:extLst>
                         <a:ext uri="{28A0092B-C50C-407E-A947-70E740481C1C}">
                           <a14:useLocalDpi xmlns:a14="http://schemas.microsoft.com/office/drawing/2010/main" val="0"/>
@@ -4432,19 +4381,37 @@
       <w:pPr>
         <w:pStyle w:val="Heading2"/>
       </w:pPr>
-      <w:bookmarkStart w:id="5" w:name="_Toc509239578"/>
+      <w:bookmarkStart w:id="4" w:name="_Toc509239578"/>
       <w:r>
         <w:t>A good place to start</w:t>
       </w:r>
+      <w:bookmarkEnd w:id="4"/>
+    </w:p>
+    <w:p>
+      <w:pPr>
+        <w:pStyle w:val="Heading3"/>
+      </w:pPr>
+      <w:bookmarkStart w:id="5" w:name="_Toc509239579"/>
+      <w:r>
+        <w:t>Quick start guide</w:t>
+      </w:r>
       <w:bookmarkEnd w:id="5"/>
     </w:p>
     <w:p>
       <w:pPr>
+        <w:pStyle w:val="BodyText"/>
+      </w:pPr>
+      <w:r>
+        <w:t>You can find this on page 7.</w:t>
+      </w:r>
+    </w:p>
+    <w:p>
+      <w:pPr>
         <w:pStyle w:val="Heading3"/>
       </w:pPr>
-      <w:bookmarkStart w:id="6" w:name="_Toc509239579"/>
-      <w:r>
-        <w:t>Quick start guide</w:t>
+      <w:bookmarkStart w:id="6" w:name="_Toc509239580"/>
+      <w:r>
+        <w:t>Troubleshooting</w:t>
       </w:r>
       <w:bookmarkEnd w:id="6"/>
     </w:p>
@@ -4453,42 +4420,24 @@
         <w:pStyle w:val="BodyText"/>
       </w:pPr>
       <w:r>
-        <w:t>You can find this on page 7.</w:t>
-      </w:r>
-    </w:p>
-    <w:p>
-      <w:pPr>
-        <w:pStyle w:val="Heading3"/>
-      </w:pPr>
-      <w:bookmarkStart w:id="7" w:name="_Toc509239580"/>
-      <w:r>
-        <w:t>Troubleshooting</w:t>
+        <w:t>You can find this on page 25.</w:t>
+      </w:r>
+    </w:p>
+    <w:p>
+      <w:pPr>
+        <w:pStyle w:val="Heading2"/>
+      </w:pPr>
+      <w:bookmarkStart w:id="7" w:name="_Toc509239581"/>
+      <w:r>
+        <w:t>Menu</w:t>
+      </w:r>
+      <w:r>
+        <w:t>s</w:t>
+      </w:r>
+      <w:r>
+        <w:t xml:space="preserve"> guide</w:t>
       </w:r>
       <w:bookmarkEnd w:id="7"/>
-    </w:p>
-    <w:p>
-      <w:pPr>
-        <w:pStyle w:val="BodyText"/>
-      </w:pPr>
-      <w:r>
-        <w:t>You can find this on page 25.</w:t>
-      </w:r>
-    </w:p>
-    <w:p>
-      <w:pPr>
-        <w:pStyle w:val="Heading2"/>
-      </w:pPr>
-      <w:bookmarkStart w:id="8" w:name="_Toc509239581"/>
-      <w:r>
-        <w:t>Menu</w:t>
-      </w:r>
-      <w:r>
-        <w:t>s</w:t>
-      </w:r>
-      <w:r>
-        <w:t xml:space="preserve"> guide</w:t>
-      </w:r>
-      <w:bookmarkEnd w:id="8"/>
     </w:p>
     <w:p>
       <w:pPr>
@@ -4570,12 +4519,12 @@
       <w:pPr>
         <w:pStyle w:val="Heading1"/>
       </w:pPr>
-      <w:bookmarkStart w:id="9" w:name="_Toc509239582"/>
+      <w:bookmarkStart w:id="8" w:name="_Toc509239582"/>
       <w:r>
         <w:lastRenderedPageBreak/>
         <w:t>Quick Start Guide</w:t>
       </w:r>
-      <w:bookmarkEnd w:id="9"/>
+      <w:bookmarkEnd w:id="8"/>
       <w:r>
         <w:t xml:space="preserve"> </w:t>
       </w:r>
@@ -4593,29 +4542,29 @@
       <w:pPr>
         <w:pStyle w:val="Heading2"/>
       </w:pPr>
-      <w:bookmarkStart w:id="10" w:name="_Toc509239583"/>
+      <w:bookmarkStart w:id="9" w:name="_Toc509239583"/>
       <w:r>
         <w:t>What are the system requirements to run 9-Tap?</w:t>
       </w:r>
+      <w:bookmarkEnd w:id="9"/>
+    </w:p>
+    <w:p>
+      <w:pPr>
+        <w:pStyle w:val="BodyTextKeep"/>
+      </w:pPr>
+      <w:r>
+        <w:t>The system requirements: Windows 7 and above. 13MB free disk space. Optimized for 1366 X 768 screen resolution. USB port. Dot matrix and ink/laser-jet printers. Microsoft Excel must be installed on the computer for the 9-Tap Tour program to work.</w:t>
+      </w:r>
+    </w:p>
+    <w:p>
+      <w:pPr>
+        <w:pStyle w:val="Heading2"/>
+      </w:pPr>
+      <w:bookmarkStart w:id="10" w:name="_Toc509239584"/>
+      <w:r>
+        <w:t>How do I install 9-Tap?</w:t>
+      </w:r>
       <w:bookmarkEnd w:id="10"/>
-    </w:p>
-    <w:p>
-      <w:pPr>
-        <w:pStyle w:val="BodyTextKeep"/>
-      </w:pPr>
-      <w:r>
-        <w:t>The system requirements: Windows 7 and above. 13MB free disk space. Optimized for 1366 X 768 screen resolution. USB port. Dot matrix and ink/laser-jet printers. Microsoft Excel must be installed on the computer for the 9-Tap Tour program to work.</w:t>
-      </w:r>
-    </w:p>
-    <w:p>
-      <w:pPr>
-        <w:pStyle w:val="Heading2"/>
-      </w:pPr>
-      <w:bookmarkStart w:id="11" w:name="_Toc509239584"/>
-      <w:r>
-        <w:t>How do I install 9-Tap?</w:t>
-      </w:r>
-      <w:bookmarkEnd w:id="11"/>
     </w:p>
     <w:p>
       <w:pPr>
@@ -4710,15 +4659,7 @@
         </w:numPr>
       </w:pPr>
       <w:r>
-        <w:t xml:space="preserve">Select a Start Menu Folder for 9-Tap Tour. Either accept the default location or chose another. If you don’t want a Start Menu folder to be created check the box “Do Not Create </w:t>
-      </w:r>
-      <w:proofErr w:type="gramStart"/>
-      <w:r>
-        <w:t>A</w:t>
-      </w:r>
-      <w:proofErr w:type="gramEnd"/>
-      <w:r>
-        <w:t xml:space="preserve"> Start Menu Folder”. Once you are satisfied with your selection click the “Next” button to continue.</w:t>
+        <w:t>Select a Start Menu Folder for 9-Tap Tour. Either accept the default location or chose another. If you don’t want a Start Menu folder to be created check the box “Do Not Create A Start Menu Folder”. Once you are satisfied with your selection click the “Next” button to continue.</w:t>
       </w:r>
     </w:p>
     <w:p>
@@ -4851,15 +4792,7 @@
         </w:numPr>
       </w:pPr>
       <w:r>
-        <w:t xml:space="preserve">Select a Start Menu Folder for 9-Tap Tour. Either accept the default location or chose another. If you don’t want a Start Menu folder to be created check the box “Do Not Create </w:t>
-      </w:r>
-      <w:proofErr w:type="gramStart"/>
-      <w:r>
-        <w:t>A</w:t>
-      </w:r>
-      <w:proofErr w:type="gramEnd"/>
-      <w:r>
-        <w:t xml:space="preserve"> Start Menu Folder”. Once you are satisfied with your selection click the “Next” button to continue.</w:t>
+        <w:t>Select a Start Menu Folder for 9-Tap Tour. Either accept the default location or chose another. If you don’t want a Start Menu folder to be created check the box “Do Not Create A Start Menu Folder”. Once you are satisfied with your selection click the “Next” button to continue.</w:t>
       </w:r>
     </w:p>
     <w:p>
@@ -4902,10 +4835,28 @@
       <w:pPr>
         <w:pStyle w:val="Heading2"/>
       </w:pPr>
-      <w:bookmarkStart w:id="12" w:name="_Toc509239585"/>
+      <w:bookmarkStart w:id="11" w:name="_Toc509239585"/>
       <w:r>
         <w:t>How do I Launch 9-Tap?</w:t>
       </w:r>
+      <w:bookmarkEnd w:id="11"/>
+    </w:p>
+    <w:p>
+      <w:pPr>
+        <w:pStyle w:val="BodyText"/>
+      </w:pPr>
+      <w:r>
+        <w:t>Double click on the desktop icon or go to the program in the system menu and click on it. This will launch 9-Tap.</w:t>
+      </w:r>
+    </w:p>
+    <w:p>
+      <w:pPr>
+        <w:pStyle w:val="Heading2"/>
+      </w:pPr>
+      <w:bookmarkStart w:id="12" w:name="_Toc509239586"/>
+      <w:r>
+        <w:t>How do I import existing members?</w:t>
+      </w:r>
       <w:bookmarkEnd w:id="12"/>
     </w:p>
     <w:p>
@@ -4913,36 +4864,18 @@
         <w:pStyle w:val="BodyText"/>
       </w:pPr>
       <w:r>
-        <w:t>Double click on the desktop icon or go to the program in the system menu and click on it. This will launch 9-Tap.</w:t>
+        <w:t>On the Member Info screen, click on the “Import” button. When the file picker screen comes up, navigate to the Excel file you need to import. Select it and click OK.</w:t>
       </w:r>
     </w:p>
     <w:p>
       <w:pPr>
         <w:pStyle w:val="Heading2"/>
       </w:pPr>
-      <w:bookmarkStart w:id="13" w:name="_Toc509239586"/>
-      <w:r>
-        <w:t>How do I import existing members?</w:t>
+      <w:bookmarkStart w:id="13" w:name="_Toc509239587"/>
+      <w:r>
+        <w:t>How do I enter a new player?</w:t>
       </w:r>
       <w:bookmarkEnd w:id="13"/>
-    </w:p>
-    <w:p>
-      <w:pPr>
-        <w:pStyle w:val="BodyText"/>
-      </w:pPr>
-      <w:r>
-        <w:t>On the Member Info screen, click on the “Import” button. When the file picker screen comes up, navigate to the Excel file you need to import. Select it and click OK.</w:t>
-      </w:r>
-    </w:p>
-    <w:p>
-      <w:pPr>
-        <w:pStyle w:val="Heading2"/>
-      </w:pPr>
-      <w:bookmarkStart w:id="14" w:name="_Toc509239587"/>
-      <w:r>
-        <w:t>How do I enter a new player?</w:t>
-      </w:r>
-      <w:bookmarkEnd w:id="14"/>
     </w:p>
     <w:p>
       <w:pPr>
@@ -4966,58 +4899,58 @@
       <w:pPr>
         <w:pStyle w:val="Heading2"/>
       </w:pPr>
-      <w:bookmarkStart w:id="15" w:name="_Toc509239588"/>
+      <w:bookmarkStart w:id="14" w:name="_Toc509239588"/>
       <w:r>
         <w:t>How do I create a tournament?</w:t>
       </w:r>
+      <w:bookmarkEnd w:id="14"/>
+    </w:p>
+    <w:p>
+      <w:pPr>
+        <w:pStyle w:val="BodyText"/>
+        <w:rPr>
+          <w:b/>
+        </w:rPr>
+      </w:pPr>
+      <w:r>
+        <w:rPr>
+          <w:b/>
+        </w:rPr>
+        <w:t>If the tournament has five (5) or fewer participants, DO NOT USE PROGRAM. Keep track of player data manually.</w:t>
+      </w:r>
+    </w:p>
+    <w:p>
+      <w:pPr>
+        <w:pStyle w:val="BodyText"/>
+      </w:pPr>
+      <w:r>
+        <w:t xml:space="preserve">On the Member Scores screen, clicking on the “Create/Edit Tournament…” button launches the New Tournament screen. Tab in the Tournament Date field and enter the date of the tournament, </w:t>
+      </w:r>
+      <w:r>
+        <w:t>then tab to the next field</w:t>
+      </w:r>
+      <w:r>
+        <w:t xml:space="preserve"> and type in the required information. Repeat the process until all required fields have been filled. </w:t>
+      </w:r>
+      <w:r>
+        <w:rPr>
+          <w:b/>
+        </w:rPr>
+        <w:t>LEAVE THE DOUBLES BOX UNCHECKED.</w:t>
+      </w:r>
+      <w:r>
+        <w:t xml:space="preserve"> If appropriate, check the “3 out of 4” box. Enter the number of squads in the Number of Squads field. Enter any notes on the tournament in the Notes field. Double check your information, then click “Create Tournament”.</w:t>
+      </w:r>
+    </w:p>
+    <w:p>
+      <w:pPr>
+        <w:pStyle w:val="Heading2"/>
+      </w:pPr>
+      <w:bookmarkStart w:id="15" w:name="_Toc509239589"/>
+      <w:r>
+        <w:t>How do I enter a member’s scores?</w:t>
+      </w:r>
       <w:bookmarkEnd w:id="15"/>
-    </w:p>
-    <w:p>
-      <w:pPr>
-        <w:pStyle w:val="BodyText"/>
-        <w:rPr>
-          <w:b/>
-        </w:rPr>
-      </w:pPr>
-      <w:r>
-        <w:rPr>
-          <w:b/>
-        </w:rPr>
-        <w:t>If the tournament has five (5) or fewer participants, DO NOT USE PROGRAM. Keep track of player data manually.</w:t>
-      </w:r>
-    </w:p>
-    <w:p>
-      <w:pPr>
-        <w:pStyle w:val="BodyText"/>
-      </w:pPr>
-      <w:r>
-        <w:t xml:space="preserve">On the Member Scores screen, clicking on the “Create/Edit Tournament…” button launches the New Tournament screen. Tab in the Tournament Date field and enter the date of the tournament, </w:t>
-      </w:r>
-      <w:r>
-        <w:t>then tab to the next field</w:t>
-      </w:r>
-      <w:r>
-        <w:t xml:space="preserve"> and type in the required information. Repeat the process until all required fields have been filled. </w:t>
-      </w:r>
-      <w:r>
-        <w:rPr>
-          <w:b/>
-        </w:rPr>
-        <w:t>LEAVE THE DOUBLES BOX UNCHECKED.</w:t>
-      </w:r>
-      <w:r>
-        <w:t xml:space="preserve"> If appropriate, check the “3 out of 4” box. Enter the number of squads in the Number of Squads field. Enter any notes on the tournament in the Notes field. Double check your information, then click “Create Tournament”.</w:t>
-      </w:r>
-    </w:p>
-    <w:p>
-      <w:pPr>
-        <w:pStyle w:val="Heading2"/>
-      </w:pPr>
-      <w:bookmarkStart w:id="16" w:name="_Toc509239589"/>
-      <w:r>
-        <w:t>How do I enter a member’s scores?</w:t>
-      </w:r>
-      <w:bookmarkEnd w:id="16"/>
     </w:p>
     <w:p>
       <w:pPr>
@@ -5122,7 +5055,7 @@
           <w:szCs w:val="36"/>
         </w:rPr>
       </w:pPr>
-      <w:bookmarkStart w:id="17" w:name="_Toc509239590"/>
+      <w:bookmarkStart w:id="16" w:name="_Toc509239590"/>
       <w:r>
         <w:rPr>
           <w:sz w:val="36"/>
@@ -5131,17 +5064,17 @@
         <w:lastRenderedPageBreak/>
         <w:t>Menu Guide</w:t>
       </w:r>
+      <w:bookmarkEnd w:id="16"/>
+    </w:p>
+    <w:p>
+      <w:pPr>
+        <w:pStyle w:val="Heading1"/>
+      </w:pPr>
+      <w:bookmarkStart w:id="17" w:name="_Toc509239591"/>
+      <w:r>
+        <w:t>Main Menu</w:t>
+      </w:r>
       <w:bookmarkEnd w:id="17"/>
-    </w:p>
-    <w:p>
-      <w:pPr>
-        <w:pStyle w:val="Heading1"/>
-      </w:pPr>
-      <w:bookmarkStart w:id="18" w:name="_Toc509239591"/>
-      <w:r>
-        <w:t>Main Menu</w:t>
-      </w:r>
-      <w:bookmarkEnd w:id="18"/>
     </w:p>
     <w:p>
       <w:pPr>
@@ -5204,7 +5137,7 @@
                     <pic:cNvPicPr/>
                   </pic:nvPicPr>
                   <pic:blipFill>
-                    <a:blip r:embed="rId14" cstate="print">
+                    <a:blip r:embed="rId18" cstate="print">
                       <a:extLst>
                         <a:ext uri="{28A0092B-C50C-407E-A947-70E740481C1C}">
                           <a14:useLocalDpi xmlns:a14="http://schemas.microsoft.com/office/drawing/2010/main" val="0"/>
@@ -5255,12 +5188,12 @@
       <w:pPr>
         <w:pStyle w:val="Heading1"/>
       </w:pPr>
-      <w:bookmarkStart w:id="19" w:name="_Toc509239592"/>
+      <w:bookmarkStart w:id="18" w:name="_Toc509239592"/>
       <w:r>
         <w:lastRenderedPageBreak/>
         <w:t>Member Info</w:t>
       </w:r>
-      <w:bookmarkEnd w:id="19"/>
+      <w:bookmarkEnd w:id="18"/>
     </w:p>
     <w:p>
       <w:pPr>
@@ -5311,7 +5244,7 @@
                     <pic:cNvPicPr/>
                   </pic:nvPicPr>
                   <pic:blipFill rotWithShape="1">
-                    <a:blip r:embed="rId15">
+                    <a:blip r:embed="rId19">
                       <a:extLst>
                         <a:ext uri="{28A0092B-C50C-407E-A947-70E740481C1C}">
                           <a14:useLocalDpi xmlns:a14="http://schemas.microsoft.com/office/drawing/2010/main" val="0"/>
@@ -5369,65 +5302,65 @@
       <w:pPr>
         <w:pStyle w:val="Heading3"/>
       </w:pPr>
-      <w:bookmarkStart w:id="20" w:name="_Toc509239593"/>
+      <w:bookmarkStart w:id="19" w:name="_Toc509239593"/>
       <w:r>
         <w:t>Import Members</w:t>
       </w:r>
+      <w:bookmarkEnd w:id="19"/>
+    </w:p>
+    <w:p>
+      <w:pPr>
+        <w:pStyle w:val="BodyText"/>
+        <w:rPr>
+          <w:b/>
+        </w:rPr>
+      </w:pPr>
+      <w:r>
+        <w:rPr>
+          <w:b/>
+        </w:rPr>
+        <w:t>Note: If you are updating from the old version of 9-Tap, please see Chapter 5, Conversion Program.</w:t>
+      </w:r>
+    </w:p>
+    <w:p>
+      <w:pPr>
+        <w:pStyle w:val="BodyText"/>
+        <w:keepNext/>
+      </w:pPr>
+      <w:r>
+        <w:t xml:space="preserve">In the Record box, click on the “Import” button. The import file window will open (see figure 10). </w:t>
+      </w:r>
+      <w:r>
+        <w:t xml:space="preserve">Chose the Excel file to be imported, double checking it’s the correct member’s file. </w:t>
+      </w:r>
+      <w:r>
+        <w:t>Click on the Excel file to be imported</w:t>
+      </w:r>
+      <w:r>
+        <w:t xml:space="preserve"> to 9-Tap</w:t>
+      </w:r>
+      <w:r>
+        <w:t xml:space="preserve">, then click “Open”. The member information will </w:t>
+      </w:r>
+      <w:r>
+        <w:t>import</w:t>
+      </w:r>
+      <w:r>
+        <w:t xml:space="preserve"> to the member database.</w:t>
+      </w:r>
+      <w:r>
+        <w:t xml:space="preserve"> </w:t>
+      </w:r>
+    </w:p>
+    <w:p>
+      <w:pPr>
+        <w:pStyle w:val="Heading3"/>
+      </w:pPr>
+      <w:bookmarkStart w:id="20" w:name="_Toc509239594"/>
+      <w:r>
+        <w:t>New Members</w:t>
+      </w:r>
       <w:bookmarkEnd w:id="20"/>
-    </w:p>
-    <w:p>
-      <w:pPr>
-        <w:pStyle w:val="BodyText"/>
-        <w:rPr>
-          <w:b/>
-        </w:rPr>
-      </w:pPr>
-      <w:r>
-        <w:rPr>
-          <w:b/>
-        </w:rPr>
-        <w:t>Note: If you are updating from the old version of 9-Tap, please see Chapter 5, Conversion Program.</w:t>
-      </w:r>
-    </w:p>
-    <w:p>
-      <w:pPr>
-        <w:pStyle w:val="BodyText"/>
-        <w:keepNext/>
-      </w:pPr>
-      <w:r>
-        <w:t xml:space="preserve">In the Record box, click on the “Import” button. The import file window will open (see figure 10). </w:t>
-      </w:r>
-      <w:r>
-        <w:t xml:space="preserve">Chose the Excel file to be imported, double checking it’s the correct member’s file. </w:t>
-      </w:r>
-      <w:r>
-        <w:t>Click on the Excel file to be imported</w:t>
-      </w:r>
-      <w:r>
-        <w:t xml:space="preserve"> to 9-Tap</w:t>
-      </w:r>
-      <w:r>
-        <w:t xml:space="preserve">, then click “Open”. The member information will </w:t>
-      </w:r>
-      <w:r>
-        <w:t>import</w:t>
-      </w:r>
-      <w:r>
-        <w:t xml:space="preserve"> to the member database.</w:t>
-      </w:r>
-      <w:r>
-        <w:t xml:space="preserve"> </w:t>
-      </w:r>
-    </w:p>
-    <w:p>
-      <w:pPr>
-        <w:pStyle w:val="Heading3"/>
-      </w:pPr>
-      <w:bookmarkStart w:id="21" w:name="_Toc509239594"/>
-      <w:r>
-        <w:t>New Members</w:t>
-      </w:r>
-      <w:bookmarkEnd w:id="21"/>
     </w:p>
     <w:p>
       <w:pPr>
@@ -5533,7 +5466,7 @@
                     <pic:cNvPicPr/>
                   </pic:nvPicPr>
                   <pic:blipFill rotWithShape="1">
-                    <a:blip r:embed="rId15">
+                    <a:blip r:embed="rId19">
                       <a:extLst>
                         <a:ext uri="{28A0092B-C50C-407E-A947-70E740481C1C}">
                           <a14:useLocalDpi xmlns:a14="http://schemas.microsoft.com/office/drawing/2010/main" val="0"/>
@@ -5591,11 +5524,11 @@
       <w:pPr>
         <w:pStyle w:val="Heading3"/>
       </w:pPr>
-      <w:bookmarkStart w:id="22" w:name="_Toc509239595"/>
+      <w:bookmarkStart w:id="21" w:name="_Toc509239595"/>
       <w:r>
         <w:t>Updating a member.</w:t>
       </w:r>
-      <w:bookmarkEnd w:id="22"/>
+      <w:bookmarkEnd w:id="21"/>
     </w:p>
     <w:p>
       <w:pPr>
@@ -5624,14 +5557,14 @@
           <w:szCs w:val="20"/>
         </w:rPr>
       </w:pPr>
-      <w:bookmarkStart w:id="23" w:name="_Toc509239596"/>
+      <w:bookmarkStart w:id="22" w:name="_Toc509239596"/>
       <w:r>
         <w:rPr>
           <w:szCs w:val="20"/>
         </w:rPr>
         <w:t>Stats</w:t>
       </w:r>
-      <w:bookmarkEnd w:id="23"/>
+      <w:bookmarkEnd w:id="22"/>
     </w:p>
     <w:p>
       <w:pPr>
@@ -5667,7 +5600,7 @@
                     <pic:cNvPicPr/>
                   </pic:nvPicPr>
                   <pic:blipFill>
-                    <a:blip r:embed="rId16">
+                    <a:blip r:embed="rId20">
                       <a:extLst>
                         <a:ext uri="{28A0092B-C50C-407E-A947-70E740481C1C}">
                           <a14:useLocalDpi xmlns:a14="http://schemas.microsoft.com/office/drawing/2010/main" val="0"/>
@@ -5721,7 +5654,7 @@
           <w:szCs w:val="20"/>
         </w:rPr>
       </w:pPr>
-      <w:bookmarkStart w:id="24" w:name="_Toc509239597"/>
+      <w:bookmarkStart w:id="23" w:name="_Toc509239597"/>
       <w:r>
         <w:rPr>
           <w:szCs w:val="20"/>
@@ -5729,7 +5662,7 @@
         <w:lastRenderedPageBreak/>
         <w:t>Member Search</w:t>
       </w:r>
-      <w:bookmarkEnd w:id="24"/>
+      <w:bookmarkEnd w:id="23"/>
     </w:p>
     <w:p>
       <w:pPr>
@@ -5786,7 +5719,7 @@
                     <pic:cNvPicPr/>
                   </pic:nvPicPr>
                   <pic:blipFill>
-                    <a:blip r:embed="rId17">
+                    <a:blip r:embed="rId21">
                       <a:extLst>
                         <a:ext uri="{28A0092B-C50C-407E-A947-70E740481C1C}">
                           <a14:useLocalDpi xmlns:a14="http://schemas.microsoft.com/office/drawing/2010/main" val="0"/>
@@ -5832,7 +5765,7 @@
                     <pic:cNvPicPr/>
                   </pic:nvPicPr>
                   <pic:blipFill>
-                    <a:blip r:embed="rId18">
+                    <a:blip r:embed="rId22">
                       <a:extLst>
                         <a:ext uri="{28A0092B-C50C-407E-A947-70E740481C1C}">
                           <a14:useLocalDpi xmlns:a14="http://schemas.microsoft.com/office/drawing/2010/main" val="0"/>
@@ -5886,14 +5819,14 @@
           <w:szCs w:val="20"/>
         </w:rPr>
       </w:pPr>
-      <w:bookmarkStart w:id="25" w:name="_Toc509239598"/>
+      <w:bookmarkStart w:id="24" w:name="_Toc509239598"/>
       <w:r>
         <w:rPr>
           <w:szCs w:val="20"/>
         </w:rPr>
         <w:t>Print Recaps</w:t>
       </w:r>
-      <w:bookmarkEnd w:id="25"/>
+      <w:bookmarkEnd w:id="24"/>
     </w:p>
     <w:p>
       <w:pPr>
@@ -5945,7 +5878,7 @@
                     <pic:cNvPicPr/>
                   </pic:nvPicPr>
                   <pic:blipFill>
-                    <a:blip r:embed="rId19">
+                    <a:blip r:embed="rId23">
                       <a:extLst>
                         <a:ext uri="{28A0092B-C50C-407E-A947-70E740481C1C}">
                           <a14:useLocalDpi xmlns:a14="http://schemas.microsoft.com/office/drawing/2010/main" val="0"/>
@@ -5991,7 +5924,7 @@
                     <pic:cNvPicPr/>
                   </pic:nvPicPr>
                   <pic:blipFill>
-                    <a:blip r:embed="rId20">
+                    <a:blip r:embed="rId24">
                       <a:extLst>
                         <a:ext uri="{28A0092B-C50C-407E-A947-70E740481C1C}">
                           <a14:useLocalDpi xmlns:a14="http://schemas.microsoft.com/office/drawing/2010/main" val="0"/>
@@ -6045,14 +5978,14 @@
           <w:szCs w:val="20"/>
         </w:rPr>
       </w:pPr>
-      <w:bookmarkStart w:id="26" w:name="_Toc509239599"/>
+      <w:bookmarkStart w:id="25" w:name="_Toc509239599"/>
       <w:r>
         <w:rPr>
           <w:szCs w:val="20"/>
         </w:rPr>
         <w:t>Import</w:t>
       </w:r>
-      <w:bookmarkEnd w:id="26"/>
+      <w:bookmarkEnd w:id="25"/>
     </w:p>
     <w:p>
       <w:pPr>
@@ -6088,7 +6021,7 @@
                     <pic:cNvPicPr/>
                   </pic:nvPicPr>
                   <pic:blipFill>
-                    <a:blip r:embed="rId21">
+                    <a:blip r:embed="rId25">
                       <a:extLst>
                         <a:ext uri="{28A0092B-C50C-407E-A947-70E740481C1C}">
                           <a14:useLocalDpi xmlns:a14="http://schemas.microsoft.com/office/drawing/2010/main" val="0"/>
@@ -6139,11 +6072,11 @@
       <w:pPr>
         <w:pStyle w:val="Heading1"/>
       </w:pPr>
-      <w:bookmarkStart w:id="27" w:name="_Toc509239600"/>
+      <w:bookmarkStart w:id="26" w:name="_Toc509239600"/>
       <w:r>
         <w:t>Member Scores</w:t>
       </w:r>
-      <w:bookmarkEnd w:id="27"/>
+      <w:bookmarkEnd w:id="26"/>
     </w:p>
     <w:p>
       <w:pPr>
@@ -6215,7 +6148,7 @@
                     <pic:cNvPicPr/>
                   </pic:nvPicPr>
                   <pic:blipFill>
-                    <a:blip r:embed="rId22">
+                    <a:blip r:embed="rId26">
                       <a:extLst>
                         <a:ext uri="{28A0092B-C50C-407E-A947-70E740481C1C}">
                           <a14:useLocalDpi xmlns:a14="http://schemas.microsoft.com/office/drawing/2010/main" val="0"/>
@@ -6291,14 +6224,14 @@
           <w:szCs w:val="20"/>
         </w:rPr>
       </w:pPr>
-      <w:bookmarkStart w:id="28" w:name="_Toc509239601"/>
+      <w:bookmarkStart w:id="27" w:name="_Toc509239601"/>
       <w:r>
         <w:rPr>
           <w:szCs w:val="20"/>
         </w:rPr>
         <w:t>Tournament Stats</w:t>
       </w:r>
-      <w:bookmarkEnd w:id="28"/>
+      <w:bookmarkEnd w:id="27"/>
     </w:p>
     <w:p>
       <w:pPr>
@@ -6338,7 +6271,7 @@
                     <pic:cNvPicPr/>
                   </pic:nvPicPr>
                   <pic:blipFill>
-                    <a:blip r:embed="rId23" cstate="print">
+                    <a:blip r:embed="rId27" cstate="print">
                       <a:extLst>
                         <a:ext uri="{28A0092B-C50C-407E-A947-70E740481C1C}">
                           <a14:useLocalDpi xmlns:a14="http://schemas.microsoft.com/office/drawing/2010/main" val="0"/>
@@ -6392,28 +6325,14 @@
           <w:szCs w:val="20"/>
         </w:rPr>
       </w:pPr>
-      <w:bookmarkStart w:id="29" w:name="_Toc509239602"/>
+      <w:bookmarkStart w:id="28" w:name="_Toc509239602"/>
       <w:r>
         <w:rPr>
           <w:szCs w:val="20"/>
         </w:rPr>
-        <w:t xml:space="preserve">Print Recaps </w:t>
-      </w:r>
-      <w:proofErr w:type="gramStart"/>
-      <w:r>
-        <w:rPr>
-          <w:szCs w:val="20"/>
-        </w:rPr>
-        <w:t>By</w:t>
-      </w:r>
-      <w:proofErr w:type="gramEnd"/>
-      <w:r>
-        <w:rPr>
-          <w:szCs w:val="20"/>
-        </w:rPr>
-        <w:t xml:space="preserve"> Tournament</w:t>
-      </w:r>
-      <w:bookmarkEnd w:id="29"/>
+        <w:t>Print Recaps By Tournament</w:t>
+      </w:r>
+      <w:bookmarkEnd w:id="28"/>
     </w:p>
     <w:p>
       <w:pPr>
@@ -6421,15 +6340,7 @@
         <w:keepNext/>
       </w:pPr>
       <w:r>
-        <w:t xml:space="preserve">In the Member Scores screen, clicking on the “Print Recaps </w:t>
-      </w:r>
-      <w:proofErr w:type="gramStart"/>
-      <w:r>
-        <w:t>By</w:t>
-      </w:r>
-      <w:proofErr w:type="gramEnd"/>
-      <w:r>
-        <w:t xml:space="preserve"> Tournament” button displays the print dialog, from where a recap can be printed or saved.</w:t>
+        <w:t>In the Member Scores screen, clicking on the “Print Recaps By Tournament” button displays the print dialog, from where a recap can be printed or saved.</w:t>
       </w:r>
     </w:p>
     <w:p>
@@ -6457,7 +6368,7 @@
                     <pic:cNvPicPr/>
                   </pic:nvPicPr>
                   <pic:blipFill>
-                    <a:blip r:embed="rId19">
+                    <a:blip r:embed="rId23">
                       <a:extLst>
                         <a:ext uri="{28A0092B-C50C-407E-A947-70E740481C1C}">
                           <a14:useLocalDpi xmlns:a14="http://schemas.microsoft.com/office/drawing/2010/main" val="0"/>
@@ -6508,12 +6419,12 @@
       <w:pPr>
         <w:pStyle w:val="Heading2"/>
       </w:pPr>
-      <w:bookmarkStart w:id="30" w:name="_Toc509239603"/>
+      <w:bookmarkStart w:id="29" w:name="_Toc509239603"/>
       <w:r>
         <w:lastRenderedPageBreak/>
         <w:t>Tournament Place Standings</w:t>
       </w:r>
-      <w:bookmarkEnd w:id="30"/>
+      <w:bookmarkEnd w:id="29"/>
     </w:p>
     <w:p>
       <w:pPr>
@@ -6549,7 +6460,7 @@
                     <pic:cNvPicPr/>
                   </pic:nvPicPr>
                   <pic:blipFill>
-                    <a:blip r:embed="rId24" cstate="print">
+                    <a:blip r:embed="rId28" cstate="print">
                       <a:extLst>
                         <a:ext uri="{28A0092B-C50C-407E-A947-70E740481C1C}">
                           <a14:useLocalDpi xmlns:a14="http://schemas.microsoft.com/office/drawing/2010/main" val="0"/>
@@ -6600,11 +6511,11 @@
       <w:pPr>
         <w:pStyle w:val="Heading2"/>
       </w:pPr>
-      <w:bookmarkStart w:id="31" w:name="_Toc509239604"/>
+      <w:bookmarkStart w:id="30" w:name="_Toc509239604"/>
       <w:r>
         <w:t>Create/Edit Tournament</w:t>
       </w:r>
-      <w:bookmarkEnd w:id="31"/>
+      <w:bookmarkEnd w:id="30"/>
     </w:p>
     <w:p>
       <w:pPr>
@@ -6653,7 +6564,7 @@
                     <pic:cNvPicPr/>
                   </pic:nvPicPr>
                   <pic:blipFill>
-                    <a:blip r:embed="rId25">
+                    <a:blip r:embed="rId29">
                       <a:extLst>
                         <a:ext uri="{28A0092B-C50C-407E-A947-70E740481C1C}">
                           <a14:useLocalDpi xmlns:a14="http://schemas.microsoft.com/office/drawing/2010/main" val="0"/>
@@ -6712,29 +6623,29 @@
       <w:pPr>
         <w:pStyle w:val="Heading3"/>
       </w:pPr>
-      <w:bookmarkStart w:id="32" w:name="_Toc509239605"/>
+      <w:bookmarkStart w:id="31" w:name="_Toc509239605"/>
       <w:r>
         <w:t>To Update an Existing Tournament</w:t>
       </w:r>
+      <w:bookmarkEnd w:id="31"/>
+    </w:p>
+    <w:p>
+      <w:pPr>
+        <w:pStyle w:val="BodyText"/>
+      </w:pPr>
+      <w:r>
+        <w:t>Click on the “Create/Edit Tournament” button. On the New Tournament screen, click “Edit Existing Tournament…” This will bring up the “Search Tournaments” screen (figure 14). See Search Tournaments for the search function. Click on the tournament that requires editing, then revise whatever information that needs revision and save the entry.</w:t>
+      </w:r>
+    </w:p>
+    <w:p>
+      <w:pPr>
+        <w:pStyle w:val="Heading2"/>
+      </w:pPr>
+      <w:bookmarkStart w:id="32" w:name="_Toc509239606"/>
+      <w:r>
+        <w:t>Search Tournaments</w:t>
+      </w:r>
       <w:bookmarkEnd w:id="32"/>
-    </w:p>
-    <w:p>
-      <w:pPr>
-        <w:pStyle w:val="BodyText"/>
-      </w:pPr>
-      <w:r>
-        <w:t>Click on the “Create/Edit Tournament” button. On the New Tournament screen, click “Edit Existing Tournament…” This will bring up the “Search Tournaments” screen (figure 14). See Search Tournaments for the search function. Click on the tournament that requires editing, then revise whatever information that needs revision and save the entry.</w:t>
-      </w:r>
-    </w:p>
-    <w:p>
-      <w:pPr>
-        <w:pStyle w:val="Heading2"/>
-      </w:pPr>
-      <w:bookmarkStart w:id="33" w:name="_Toc509239606"/>
-      <w:r>
-        <w:t>Search Tournaments</w:t>
-      </w:r>
-      <w:bookmarkEnd w:id="33"/>
     </w:p>
     <w:p>
       <w:pPr>
@@ -6774,7 +6685,7 @@
                     <pic:cNvPicPr/>
                   </pic:nvPicPr>
                   <pic:blipFill>
-                    <a:blip r:embed="rId26">
+                    <a:blip r:embed="rId30">
                       <a:extLst>
                         <a:ext uri="{28A0092B-C50C-407E-A947-70E740481C1C}">
                           <a14:useLocalDpi xmlns:a14="http://schemas.microsoft.com/office/drawing/2010/main" val="0"/>
@@ -6820,7 +6731,7 @@
                     <pic:cNvPicPr/>
                   </pic:nvPicPr>
                   <pic:blipFill>
-                    <a:blip r:embed="rId27">
+                    <a:blip r:embed="rId31">
                       <a:extLst>
                         <a:ext uri="{28A0092B-C50C-407E-A947-70E740481C1C}">
                           <a14:useLocalDpi xmlns:a14="http://schemas.microsoft.com/office/drawing/2010/main" val="0"/>
@@ -6871,11 +6782,11 @@
       <w:pPr>
         <w:pStyle w:val="Heading3"/>
       </w:pPr>
-      <w:bookmarkStart w:id="34" w:name="_Toc509239607"/>
+      <w:bookmarkStart w:id="33" w:name="_Toc509239607"/>
       <w:r>
         <w:t>Search by Location</w:t>
       </w:r>
-      <w:bookmarkEnd w:id="34"/>
+      <w:bookmarkEnd w:id="33"/>
     </w:p>
     <w:p>
       <w:pPr>
@@ -6904,10 +6815,28 @@
       <w:pPr>
         <w:pStyle w:val="Heading3"/>
       </w:pPr>
-      <w:bookmarkStart w:id="35" w:name="_Toc509239608"/>
+      <w:bookmarkStart w:id="34" w:name="_Toc509239608"/>
       <w:r>
         <w:t>Search by Event</w:t>
       </w:r>
+      <w:bookmarkEnd w:id="34"/>
+    </w:p>
+    <w:p>
+      <w:pPr>
+        <w:pStyle w:val="BodyText"/>
+      </w:pPr>
+      <w:r>
+        <w:t>To find a tournament by event, enter the name of the event in the “Event” field, then click “Search”. Click on the tournament from the list, then click “Accept”.</w:t>
+      </w:r>
+    </w:p>
+    <w:p>
+      <w:pPr>
+        <w:pStyle w:val="Heading3"/>
+      </w:pPr>
+      <w:bookmarkStart w:id="35" w:name="_Toc509239609"/>
+      <w:r>
+        <w:t>Search by Date</w:t>
+      </w:r>
       <w:bookmarkEnd w:id="35"/>
     </w:p>
     <w:p>
@@ -6915,24 +6844,6 @@
         <w:pStyle w:val="BodyText"/>
       </w:pPr>
       <w:r>
-        <w:t>To find a tournament by event, enter the name of the event in the “Event” field, then click “Search”. Click on the tournament from the list, then click “Accept”.</w:t>
-      </w:r>
-    </w:p>
-    <w:p>
-      <w:pPr>
-        <w:pStyle w:val="Heading3"/>
-      </w:pPr>
-      <w:bookmarkStart w:id="36" w:name="_Toc509239609"/>
-      <w:r>
-        <w:t>Search by Date</w:t>
-      </w:r>
-      <w:bookmarkEnd w:id="36"/>
-    </w:p>
-    <w:p>
-      <w:pPr>
-        <w:pStyle w:val="BodyText"/>
-      </w:pPr>
-      <w:r>
         <w:t>To find a tournament by date, check the “Date” box. Then choose the date range with the “From” and “To” date fields. Then click “Search”. Choose the tournament from the list, then click “Accept”.</w:t>
       </w:r>
     </w:p>
@@ -6940,12 +6851,12 @@
       <w:pPr>
         <w:pStyle w:val="Heading2"/>
       </w:pPr>
-      <w:bookmarkStart w:id="37" w:name="_Toc509239610"/>
+      <w:bookmarkStart w:id="36" w:name="_Toc509239610"/>
       <w:r>
         <w:lastRenderedPageBreak/>
         <w:t>List Tournaments by year</w:t>
       </w:r>
-      <w:bookmarkEnd w:id="37"/>
+      <w:bookmarkEnd w:id="36"/>
     </w:p>
     <w:p>
       <w:pPr>
@@ -6953,15 +6864,7 @@
         <w:keepNext/>
       </w:pPr>
       <w:r>
-        <w:t xml:space="preserve">The “List Tournaments </w:t>
-      </w:r>
-      <w:proofErr w:type="gramStart"/>
-      <w:r>
-        <w:t>By</w:t>
-      </w:r>
-      <w:proofErr w:type="gramEnd"/>
-      <w:r>
-        <w:t xml:space="preserve"> Year” button displays the screen that lists Tournaments by Year. To display tournaments for a year, choose the year from the drop down menu, the tournaments from that year will appear.</w:t>
+        <w:t>The “List Tournaments By Year” button displays the screen that lists Tournaments by Year. To display tournaments for a year, choose the year from the drop down menu, the tournaments from that year will appear.</w:t>
       </w:r>
     </w:p>
     <w:p>
@@ -6989,7 +6892,7 @@
                     <pic:cNvPicPr/>
                   </pic:nvPicPr>
                   <pic:blipFill>
-                    <a:blip r:embed="rId28" cstate="print">
+                    <a:blip r:embed="rId32" cstate="print">
                       <a:extLst>
                         <a:ext uri="{28A0092B-C50C-407E-A947-70E740481C1C}">
                           <a14:useLocalDpi xmlns:a14="http://schemas.microsoft.com/office/drawing/2010/main" val="0"/>
@@ -7037,7 +6940,7 @@
                     </pic:cNvPicPr>
                   </pic:nvPicPr>
                   <pic:blipFill>
-                    <a:blip r:embed="rId29" cstate="print">
+                    <a:blip r:embed="rId33" cstate="print">
                       <a:extLst>
                         <a:ext uri="{28A0092B-C50C-407E-A947-70E740481C1C}">
                           <a14:useLocalDpi xmlns:a14="http://schemas.microsoft.com/office/drawing/2010/main" val="0"/>
@@ -7093,11 +6996,11 @@
       <w:pPr>
         <w:pStyle w:val="Heading2"/>
       </w:pPr>
-      <w:bookmarkStart w:id="38" w:name="_Toc509239611"/>
+      <w:bookmarkStart w:id="37" w:name="_Toc509239611"/>
       <w:r>
         <w:t>Reports</w:t>
       </w:r>
-      <w:bookmarkEnd w:id="38"/>
+      <w:bookmarkEnd w:id="37"/>
     </w:p>
     <w:p>
       <w:pPr>
@@ -7120,15 +7023,7 @@
         <w:t xml:space="preserve">standings so far. </w:t>
       </w:r>
       <w:r>
-        <w:t>In the Reports field, you can access the member scores reports through either the “</w:t>
-      </w:r>
-      <w:proofErr w:type="gramStart"/>
-      <w:r>
-        <w:t>Seniors</w:t>
-      </w:r>
-      <w:proofErr w:type="gramEnd"/>
-      <w:r>
-        <w:t>”, or “Game”, or “Series” buttons. Clicking the appropriate button for the needed report will open the Member Scores Reports dialog. Enter the number of top places in the field and click “Print”. This goes to the print dialog where it can be printed directly.</w:t>
+        <w:t>In the Reports field, you can access the member scores reports through either the “Seniors”, or “Game”, or “Series” buttons. Clicking the appropriate button for the needed report will open the Member Scores Reports dialog. Enter the number of top places in the field and click “Print”. This goes to the print dialog where it can be printed directly.</w:t>
       </w:r>
     </w:p>
     <w:p>
@@ -7157,7 +7052,7 @@
                     <pic:cNvPicPr/>
                   </pic:nvPicPr>
                   <pic:blipFill>
-                    <a:blip r:embed="rId30">
+                    <a:blip r:embed="rId34">
                       <a:extLst>
                         <a:ext uri="{28A0092B-C50C-407E-A947-70E740481C1C}">
                           <a14:useLocalDpi xmlns:a14="http://schemas.microsoft.com/office/drawing/2010/main" val="0"/>
@@ -7208,11 +7103,11 @@
       <w:pPr>
         <w:pStyle w:val="Heading2"/>
       </w:pPr>
-      <w:bookmarkStart w:id="39" w:name="_Toc509239612"/>
+      <w:bookmarkStart w:id="38" w:name="_Toc509239612"/>
       <w:r>
         <w:t>Tournament Results</w:t>
       </w:r>
-      <w:bookmarkEnd w:id="39"/>
+      <w:bookmarkEnd w:id="38"/>
     </w:p>
     <w:p>
       <w:pPr>
@@ -7257,7 +7152,7 @@
                     <pic:cNvPicPr/>
                   </pic:nvPicPr>
                   <pic:blipFill>
-                    <a:blip r:embed="rId31">
+                    <a:blip r:embed="rId35">
                       <a:extLst>
                         <a:ext uri="{28A0092B-C50C-407E-A947-70E740481C1C}">
                           <a14:useLocalDpi xmlns:a14="http://schemas.microsoft.com/office/drawing/2010/main" val="0"/>
@@ -7308,33 +7203,33 @@
       <w:pPr>
         <w:pStyle w:val="Heading2"/>
       </w:pPr>
-      <w:bookmarkStart w:id="40" w:name="_Toc509239613"/>
+      <w:bookmarkStart w:id="39" w:name="_Toc509239613"/>
       <w:r>
         <w:t>Comments</w:t>
       </w:r>
+      <w:bookmarkEnd w:id="39"/>
+    </w:p>
+    <w:p>
+      <w:pPr>
+        <w:pStyle w:val="BodyText"/>
+      </w:pPr>
+      <w:r>
+        <w:t>On the Member Scores Screen, comments regarding the tournament can be entered in the Comments field.</w:t>
+      </w:r>
+    </w:p>
+    <w:p>
+      <w:pPr>
+        <w:pStyle w:val="Heading2"/>
+      </w:pPr>
+      <w:bookmarkStart w:id="40" w:name="_Toc509239614"/>
+      <w:r>
+        <w:t>Finalize Tournament</w:t>
+      </w:r>
       <w:bookmarkEnd w:id="40"/>
     </w:p>
     <w:p>
       <w:pPr>
         <w:pStyle w:val="BodyText"/>
-      </w:pPr>
-      <w:r>
-        <w:t>On the Member Scores Screen, comments regarding the tournament can be entered in the Comments field.</w:t>
-      </w:r>
-    </w:p>
-    <w:p>
-      <w:pPr>
-        <w:pStyle w:val="Heading2"/>
-      </w:pPr>
-      <w:bookmarkStart w:id="41" w:name="_Toc509239614"/>
-      <w:r>
-        <w:t>Finalize Tournament</w:t>
-      </w:r>
-      <w:bookmarkEnd w:id="41"/>
-    </w:p>
-    <w:p>
-      <w:pPr>
-        <w:pStyle w:val="BodyText"/>
         <w:keepNext/>
       </w:pPr>
       <w:r>
@@ -7377,11 +7272,11 @@
         <w:fldChar w:fldCharType="end"/>
       </w:r>
       <w:r>
-        <w:t xml:space="preserve"> field. The Adjusted Average determines the member’s handicap for the next tournament in which they are competing. Once the information </w:t>
+        <w:t xml:space="preserve"> field. The Adjusted Average determines the member’s handicap for the next tournament in which they are competing. Once the information has been validated, the director checks off the </w:t>
       </w:r>
       <w:r>
         <w:lastRenderedPageBreak/>
-        <w:t>has been validated, the director checks off the “Director Check” boxes. Then “Finalize” is clicked and the information is saved to the database.</w:t>
+        <w:t>“Director Check” boxes. Then “Finalize” is clicked and the information is saved to the database.</w:t>
       </w:r>
     </w:p>
     <w:p>
@@ -7408,7 +7303,7 @@
                     <pic:cNvPicPr/>
                   </pic:nvPicPr>
                   <pic:blipFill>
-                    <a:blip r:embed="rId32" cstate="print">
+                    <a:blip r:embed="rId36" cstate="print">
                       <a:extLst>
                         <a:ext uri="{28A0092B-C50C-407E-A947-70E740481C1C}">
                           <a14:useLocalDpi xmlns:a14="http://schemas.microsoft.com/office/drawing/2010/main" val="0"/>
@@ -7458,11 +7353,11 @@
       <w:pPr>
         <w:pStyle w:val="Heading1"/>
       </w:pPr>
-      <w:bookmarkStart w:id="42" w:name="_Toc509239615"/>
+      <w:bookmarkStart w:id="41" w:name="_Toc509239615"/>
       <w:r>
         <w:t>Tools</w:t>
       </w:r>
-      <w:bookmarkEnd w:id="42"/>
+      <w:bookmarkEnd w:id="41"/>
     </w:p>
     <w:p>
       <w:pPr>
@@ -7498,7 +7393,7 @@
                     <pic:cNvPicPr/>
                   </pic:nvPicPr>
                   <pic:blipFill>
-                    <a:blip r:embed="rId33">
+                    <a:blip r:embed="rId37">
                       <a:extLst>
                         <a:ext uri="{28A0092B-C50C-407E-A947-70E740481C1C}">
                           <a14:useLocalDpi xmlns:a14="http://schemas.microsoft.com/office/drawing/2010/main" val="0"/>
@@ -7604,8 +7499,8 @@
       <w:pPr>
         <w:pStyle w:val="Heading1"/>
       </w:pPr>
-      <w:bookmarkStart w:id="43" w:name="_Toc508962069"/>
-      <w:bookmarkStart w:id="44" w:name="_Toc509239616"/>
+      <w:bookmarkStart w:id="42" w:name="_Toc508962069"/>
+      <w:bookmarkStart w:id="43" w:name="_Toc509239616"/>
       <w:r>
         <w:lastRenderedPageBreak/>
         <w:t>Troubleshooting</w:t>
@@ -7628,8 +7523,8 @@
       <w:r>
         <w:t xml:space="preserve"> 9-Tap</w:t>
       </w:r>
+      <w:bookmarkEnd w:id="42"/>
       <w:bookmarkEnd w:id="43"/>
-      <w:bookmarkEnd w:id="44"/>
     </w:p>
     <w:p>
       <w:pPr>
@@ -7639,8 +7534,8 @@
           <w:szCs w:val="24"/>
         </w:rPr>
       </w:pPr>
-      <w:bookmarkStart w:id="45" w:name="_Toc508962070"/>
-      <w:bookmarkStart w:id="46" w:name="_Toc509239617"/>
+      <w:bookmarkStart w:id="44" w:name="_Toc508962070"/>
+      <w:bookmarkStart w:id="45" w:name="_Toc509239617"/>
       <w:r>
         <w:rPr>
           <w:sz w:val="24"/>
@@ -7662,84 +7557,84 @@
         </w:rPr>
         <w:t>:</w:t>
       </w:r>
+      <w:bookmarkEnd w:id="44"/>
       <w:bookmarkEnd w:id="45"/>
+    </w:p>
+    <w:p>
+      <w:pPr>
+        <w:pStyle w:val="BodyText"/>
+      </w:pPr>
+      <w:r>
+        <w:rPr>
+          <w:b/>
+        </w:rPr>
+        <w:t xml:space="preserve">If </w:t>
+      </w:r>
+      <w:r>
+        <w:rPr>
+          <w:b/>
+        </w:rPr>
+        <w:t xml:space="preserve">the </w:t>
+      </w:r>
+      <w:r>
+        <w:rPr>
+          <w:b/>
+        </w:rPr>
+        <w:t>tournament has five (5) or fewer participants, DO NOT USE PROGRAM. Keep track of player data manually</w:t>
+      </w:r>
+      <w:r>
+        <w:t>.</w:t>
+      </w:r>
+    </w:p>
+    <w:p>
+      <w:pPr>
+        <w:pStyle w:val="BodyText"/>
+      </w:pPr>
+      <w:r>
+        <w:t xml:space="preserve">Doubles tournaments are not supported by the software at this time. </w:t>
+      </w:r>
+    </w:p>
+    <w:p>
+      <w:pPr>
+        <w:pStyle w:val="BodyText"/>
+        <w:rPr>
+          <w:b/>
+        </w:rPr>
+      </w:pPr>
+      <w:r>
+        <w:rPr>
+          <w:b/>
+        </w:rPr>
+        <w:t>LEAVE DOUBLES UNCHECKED ON THE NEW TOURNAMENT SCREEN/DIALOG.</w:t>
+      </w:r>
+    </w:p>
+    <w:p>
+      <w:pPr>
+        <w:pStyle w:val="BodyText"/>
+      </w:pPr>
+      <w:r>
+        <w:t>Do not start a new tournament before the current tournament you are working on has been finalized.</w:t>
+      </w:r>
+    </w:p>
+    <w:p>
+      <w:pPr>
+        <w:pStyle w:val="BodyText"/>
+      </w:pPr>
+      <w:r>
+        <w:t>When entering member scores on the Member Scores page, if the member has a complimentary entry into the tournament, make sure the Comp Entry box is checked.</w:t>
+      </w:r>
+    </w:p>
+    <w:p>
+      <w:pPr>
+        <w:pStyle w:val="Heading2"/>
+      </w:pPr>
+      <w:bookmarkStart w:id="46" w:name="_Toc508962071"/>
+      <w:bookmarkStart w:id="47" w:name="_Toc509239618"/>
+      <w:r>
+        <w:t>Screen “splitting” on resize</w:t>
+      </w:r>
       <w:bookmarkEnd w:id="46"/>
-    </w:p>
-    <w:p>
-      <w:pPr>
-        <w:pStyle w:val="BodyText"/>
-      </w:pPr>
-      <w:r>
-        <w:rPr>
-          <w:b/>
-        </w:rPr>
-        <w:t xml:space="preserve">If </w:t>
-      </w:r>
-      <w:r>
-        <w:rPr>
-          <w:b/>
-        </w:rPr>
-        <w:t xml:space="preserve">the </w:t>
-      </w:r>
-      <w:r>
-        <w:rPr>
-          <w:b/>
-        </w:rPr>
-        <w:t>tournament has five (5) or fewer participants, DO NOT USE PROGRAM. Keep track of player data manually</w:t>
-      </w:r>
-      <w:r>
-        <w:t>.</w:t>
-      </w:r>
-    </w:p>
-    <w:p>
-      <w:pPr>
-        <w:pStyle w:val="BodyText"/>
-      </w:pPr>
-      <w:r>
-        <w:t xml:space="preserve">Doubles tournaments are not supported by the software at this time. </w:t>
-      </w:r>
-    </w:p>
-    <w:p>
-      <w:pPr>
-        <w:pStyle w:val="BodyText"/>
-        <w:rPr>
-          <w:b/>
-        </w:rPr>
-      </w:pPr>
-      <w:r>
-        <w:rPr>
-          <w:b/>
-        </w:rPr>
-        <w:t>LEAVE DOUBLES UNCHECKED ON THE NEW TOURNAMENT SCREEN/DIALOG.</w:t>
-      </w:r>
-    </w:p>
-    <w:p>
-      <w:pPr>
-        <w:pStyle w:val="BodyText"/>
-      </w:pPr>
-      <w:r>
-        <w:t>Do not start a new tournament before the current tournament you are working on has been finalized.</w:t>
-      </w:r>
-    </w:p>
-    <w:p>
-      <w:pPr>
-        <w:pStyle w:val="BodyText"/>
-      </w:pPr>
-      <w:r>
-        <w:t>When entering member scores on the Member Scores page, if the member has a complimentary entry into the tournament, make sure the Comp Entry box is checked.</w:t>
-      </w:r>
-    </w:p>
-    <w:p>
-      <w:pPr>
-        <w:pStyle w:val="Heading2"/>
-      </w:pPr>
-      <w:bookmarkStart w:id="47" w:name="_Toc508962071"/>
-      <w:bookmarkStart w:id="48" w:name="_Toc509239618"/>
-      <w:r>
-        <w:t>Screen “splitting” on resize</w:t>
-      </w:r>
       <w:bookmarkEnd w:id="47"/>
-      <w:bookmarkEnd w:id="48"/>
     </w:p>
     <w:p>
       <w:pPr>
@@ -7775,7 +7670,7 @@
                     <pic:cNvPicPr/>
                   </pic:nvPicPr>
                   <pic:blipFill>
-                    <a:blip r:embed="rId34" cstate="print">
+                    <a:blip r:embed="rId38" cstate="print">
                       <a:extLst>
                         <a:ext uri="{28A0092B-C50C-407E-A947-70E740481C1C}">
                           <a14:useLocalDpi xmlns:a14="http://schemas.microsoft.com/office/drawing/2010/main" val="0"/>
@@ -7976,7 +7871,7 @@
                     <pic:cNvPicPr/>
                   </pic:nvPicPr>
                   <pic:blipFill>
-                    <a:blip r:embed="rId35">
+                    <a:blip r:embed="rId39">
                       <a:extLst>
                         <a:ext uri="{28A0092B-C50C-407E-A947-70E740481C1C}">
                           <a14:useLocalDpi xmlns:a14="http://schemas.microsoft.com/office/drawing/2010/main" val="0"/>
@@ -8029,8 +7924,8 @@
           <w:szCs w:val="24"/>
         </w:rPr>
       </w:pPr>
-      <w:bookmarkStart w:id="49" w:name="_Toc508962072"/>
-      <w:bookmarkStart w:id="50" w:name="_Toc509239619"/>
+      <w:bookmarkStart w:id="48" w:name="_Toc508962072"/>
+      <w:bookmarkStart w:id="49" w:name="_Toc509239619"/>
       <w:r>
         <w:rPr>
           <w:sz w:val="24"/>
@@ -8039,8 +7934,8 @@
         <w:lastRenderedPageBreak/>
         <w:t>ReadMe File</w:t>
       </w:r>
+      <w:bookmarkEnd w:id="48"/>
       <w:bookmarkEnd w:id="49"/>
-      <w:bookmarkEnd w:id="50"/>
       <w:r>
         <w:rPr>
           <w:sz w:val="24"/>
@@ -8153,14 +8048,14 @@
       <w:pPr>
         <w:pStyle w:val="Heading1"/>
       </w:pPr>
-      <w:bookmarkStart w:id="51" w:name="_Toc508962073"/>
-      <w:bookmarkStart w:id="52" w:name="_Toc509239620"/>
+      <w:bookmarkStart w:id="50" w:name="_Toc508962073"/>
+      <w:bookmarkStart w:id="51" w:name="_Toc509239620"/>
       <w:r>
         <w:lastRenderedPageBreak/>
         <w:t>Conversion Program</w:t>
       </w:r>
+      <w:bookmarkEnd w:id="50"/>
       <w:bookmarkEnd w:id="51"/>
-      <w:bookmarkEnd w:id="52"/>
       <w:r>
         <w:fldChar w:fldCharType="begin"/>
       </w:r>
@@ -8235,15 +8130,7 @@
         <w:t xml:space="preserve"> Click the Open file button and select the membership.dat file to upload. This will upload the members’ information such as name, average, handicap, bonus pins, etc</w:t>
       </w:r>
       <w:r>
-        <w:t>. To import the members’ statistics, click on the Select .</w:t>
-      </w:r>
-      <w:proofErr w:type="spellStart"/>
-      <w:r>
-        <w:t>xls</w:t>
-      </w:r>
-      <w:proofErr w:type="spellEnd"/>
-      <w:r>
-        <w:t xml:space="preserve"> Folder button.</w:t>
+        <w:t>. To import the members’ statistics, click on the Select .xls Folder button.</w:t>
       </w:r>
       <w:r>
         <w:t xml:space="preserve"> Importi</w:t>
@@ -8260,15 +8147,7 @@
         <w:pStyle w:val="BodyText"/>
       </w:pPr>
       <w:r>
-        <w:t>If you are pressed for time, you can import just the member info (.</w:t>
-      </w:r>
-      <w:proofErr w:type="spellStart"/>
-      <w:r>
-        <w:t>dat</w:t>
-      </w:r>
-      <w:proofErr w:type="spellEnd"/>
-      <w:r>
-        <w:t>) files. Then as needed you can use the “Import” button on the Member Info screen to import members one at a time.</w:t>
+        <w:t>If you are pressed for time, you can import just the member info (.dat) files. Then as needed you can use the “Import” button on the Member Info screen to import members one at a time.</w:t>
       </w:r>
     </w:p>
     <w:p>
@@ -8329,14 +8208,14 @@
       <w:pPr>
         <w:pStyle w:val="Heading1"/>
       </w:pPr>
-      <w:bookmarkStart w:id="53" w:name="_Toc508962074"/>
-      <w:bookmarkStart w:id="54" w:name="_Toc509239621"/>
+      <w:bookmarkStart w:id="52" w:name="_Toc508962074"/>
+      <w:bookmarkStart w:id="53" w:name="_Toc509239621"/>
       <w:r>
         <w:lastRenderedPageBreak/>
         <w:t>General Information</w:t>
       </w:r>
+      <w:bookmarkEnd w:id="52"/>
       <w:bookmarkEnd w:id="53"/>
-      <w:bookmarkEnd w:id="54"/>
       <w:r>
         <w:fldChar w:fldCharType="begin"/>
       </w:r>
@@ -8372,8 +8251,8 @@
           <w:szCs w:val="22"/>
         </w:rPr>
       </w:pPr>
-      <w:bookmarkStart w:id="55" w:name="_Toc508962075"/>
-      <w:bookmarkStart w:id="56" w:name="_Toc509239622"/>
+      <w:bookmarkStart w:id="54" w:name="_Toc508962075"/>
+      <w:bookmarkStart w:id="55" w:name="_Toc509239622"/>
       <w:r>
         <w:rPr>
           <w:sz w:val="22"/>
@@ -8381,8 +8260,8 @@
         </w:rPr>
         <w:t>Main Menu</w:t>
       </w:r>
+      <w:bookmarkEnd w:id="54"/>
       <w:bookmarkEnd w:id="55"/>
-      <w:bookmarkEnd w:id="56"/>
       <w:r>
         <w:rPr>
           <w:sz w:val="22"/>
@@ -8516,11 +8395,9 @@
         </w:rPr>
         <w:instrText>Main Menu</w:instrText>
       </w:r>
-      <w:proofErr w:type="gramStart"/>
       <w:r>
         <w:instrText xml:space="preserve">" </w:instrText>
       </w:r>
-      <w:proofErr w:type="gramEnd"/>
       <w:r>
         <w:fldChar w:fldCharType="end"/>
       </w:r>
@@ -8822,13 +8699,13 @@
       <w:pPr>
         <w:pStyle w:val="Heading2"/>
       </w:pPr>
-      <w:bookmarkStart w:id="57" w:name="_Toc508962076"/>
-      <w:bookmarkStart w:id="58" w:name="_Toc509239623"/>
+      <w:bookmarkStart w:id="56" w:name="_Toc508962076"/>
+      <w:bookmarkStart w:id="57" w:name="_Toc509239623"/>
       <w:r>
         <w:t>Member Info</w:t>
       </w:r>
+      <w:bookmarkEnd w:id="56"/>
       <w:bookmarkEnd w:id="57"/>
-      <w:bookmarkEnd w:id="58"/>
       <w:r>
         <w:fldChar w:fldCharType="begin"/>
       </w:r>
@@ -8898,6 +8775,7 @@
         </w:numPr>
       </w:pPr>
       <w:r>
+        <w:lastRenderedPageBreak/>
         <w:t>Member Number</w:t>
       </w:r>
       <w:r>
@@ -8964,7 +8842,6 @@
         </w:numPr>
       </w:pPr>
       <w:r>
-        <w:lastRenderedPageBreak/>
         <w:t>Member Information area.</w:t>
       </w:r>
     </w:p>
@@ -8977,23 +8854,7 @@
         </w:numPr>
       </w:pPr>
       <w:r>
-        <w:t>D.O.B.—member’s date of birth, mm/</w:t>
-      </w:r>
-      <w:proofErr w:type="spellStart"/>
-      <w:r>
-        <w:t>dd</w:t>
-      </w:r>
-      <w:proofErr w:type="spellEnd"/>
-      <w:r>
-        <w:t>/</w:t>
-      </w:r>
-      <w:proofErr w:type="spellStart"/>
-      <w:r>
-        <w:t>yyyy</w:t>
-      </w:r>
-      <w:proofErr w:type="spellEnd"/>
-      <w:r>
-        <w:t xml:space="preserve"> format.</w:t>
+        <w:t>D.O.B.—member’s date of birth, mm/dd/yyyy format.</w:t>
       </w:r>
     </w:p>
     <w:p>
@@ -9233,6 +9094,7 @@
         </w:numPr>
       </w:pPr>
       <w:r>
+        <w:lastRenderedPageBreak/>
         <w:t>Year End Tournaments</w:t>
       </w:r>
       <w:r>
@@ -9405,7 +9267,6 @@
         </w:numPr>
       </w:pPr>
       <w:r>
-        <w:lastRenderedPageBreak/>
         <w:t>Import—imports member information from an excel file.</w:t>
       </w:r>
     </w:p>
@@ -9562,40 +9423,7 @@
         </w:numPr>
       </w:pPr>
       <w:r>
-        <w:t>Stats</w:t>
-      </w:r>
-      <w:r>
-        <w:fldChar w:fldCharType="begin"/>
-      </w:r>
-      <w:r>
-        <w:instrText>E "</w:instrText>
-      </w:r>
-      <w:r>
-        <w:instrText>Stats</w:instrText>
-      </w:r>
-      <w:r>
-        <w:instrText xml:space="preserve">" </w:instrText>
-      </w:r>
-      <w:r>
-        <w:fldChar w:fldCharType="end"/>
-      </w:r>
-      <w:r>
-        <w:fldChar w:fldCharType="begin"/>
-      </w:r>
-      <w:r>
-        <w:instrText>E "</w:instrText>
-      </w:r>
-      <w:r>
-        <w:instrText>Stats</w:instrText>
-      </w:r>
-      <w:r>
-        <w:instrText xml:space="preserve">" </w:instrText>
-      </w:r>
-      <w:r>
-        <w:fldChar w:fldCharType="end"/>
-      </w:r>
-      <w:r>
-        <w:t>— this button brings up currently selected member’s statistics.</w:t>
+        <w:t>Stats— this button brings up currently selected member’s statistics.</w:t>
       </w:r>
     </w:p>
     <w:p>
@@ -9637,40 +9465,7 @@
         </w:numPr>
       </w:pPr>
       <w:r>
-        <w:t>Member Search</w:t>
-      </w:r>
-      <w:r>
-        <w:fldChar w:fldCharType="begin"/>
-      </w:r>
-      <w:r>
-        <w:instrText xml:space="preserve"> E "</w:instrText>
-      </w:r>
-      <w:r>
-        <w:instrText>Member Search</w:instrText>
-      </w:r>
-      <w:r>
-        <w:instrText xml:space="preserve">" </w:instrText>
-      </w:r>
-      <w:r>
-        <w:fldChar w:fldCharType="end"/>
-      </w:r>
-      <w:r>
-        <w:fldChar w:fldCharType="begin"/>
-      </w:r>
-      <w:r>
-        <w:instrText>E "</w:instrText>
-      </w:r>
-      <w:r>
-        <w:instrText>Member Search</w:instrText>
-      </w:r>
-      <w:r>
-        <w:instrText xml:space="preserve">" </w:instrText>
-      </w:r>
-      <w:r>
-        <w:fldChar w:fldCharType="end"/>
-      </w:r>
-      <w:r>
-        <w:t>—this button brings up member search screen, used to search for member records.</w:t>
+        <w:t>Member Search—this button brings up member search screen, used to search for member records.</w:t>
       </w:r>
     </w:p>
     <w:p>
@@ -9700,36 +9495,6 @@
         <w:fldChar w:fldCharType="end"/>
       </w:r>
       <w:r>
-        <w:fldChar w:fldCharType="begin"/>
-      </w:r>
-      <w:r>
-        <w:instrText xml:space="preserve"> E "</w:instrText>
-      </w:r>
-      <w:r>
-        <w:instrText>Print Recaps</w:instrText>
-      </w:r>
-      <w:r>
-        <w:instrText xml:space="preserve">" </w:instrText>
-      </w:r>
-      <w:r>
-        <w:fldChar w:fldCharType="end"/>
-      </w:r>
-      <w:r>
-        <w:fldChar w:fldCharType="begin"/>
-      </w:r>
-      <w:r>
-        <w:instrText>E "</w:instrText>
-      </w:r>
-      <w:r>
-        <w:instrText>Print Recaps</w:instrText>
-      </w:r>
-      <w:r>
-        <w:instrText xml:space="preserve">" </w:instrText>
-      </w:r>
-      <w:r>
-        <w:fldChar w:fldCharType="end"/>
-      </w:r>
-      <w:r>
         <w:t xml:space="preserve"> section</w:t>
       </w:r>
     </w:p>
@@ -9754,15 +9519,7 @@
         </w:numPr>
       </w:pPr>
       <w:r>
-        <w:t>Print By Date—this button brings up the print by date dialog screen</w:t>
-      </w:r>
-      <w:proofErr w:type="gramStart"/>
-      <w:r>
-        <w:t>..</w:t>
-      </w:r>
-      <w:proofErr w:type="gramEnd"/>
-      <w:r>
-        <w:t xml:space="preserve"> Prints a range of records by date.</w:t>
+        <w:t>Print By Date—this button brings up the print by date dialog screen.. Prints a range of records by date.</w:t>
       </w:r>
     </w:p>
     <w:p>
@@ -9774,28 +9531,21 @@
         </w:numPr>
       </w:pPr>
       <w:r>
-        <w:t xml:space="preserve">Print </w:t>
-      </w:r>
-      <w:proofErr w:type="gramStart"/>
-      <w:r>
-        <w:t>By</w:t>
-      </w:r>
-      <w:proofErr w:type="gramEnd"/>
-      <w:r>
-        <w:t xml:space="preserve"> Tournament—this button launches your computer’s print dialog. Prints member record by tournament.</w:t>
+        <w:t>Print By Tournament—this button launches your computer’s print dialog. Prints member record by tournament.</w:t>
       </w:r>
     </w:p>
     <w:p>
       <w:pPr>
         <w:pStyle w:val="Heading2"/>
       </w:pPr>
-      <w:bookmarkStart w:id="59" w:name="_Toc508962077"/>
-      <w:bookmarkStart w:id="60" w:name="_Toc509239624"/>
-      <w:r>
+      <w:bookmarkStart w:id="58" w:name="_Toc508962077"/>
+      <w:bookmarkStart w:id="59" w:name="_Toc509239624"/>
+      <w:r>
+        <w:lastRenderedPageBreak/>
         <w:t>Member Scores</w:t>
       </w:r>
+      <w:bookmarkEnd w:id="58"/>
       <w:bookmarkEnd w:id="59"/>
-      <w:bookmarkEnd w:id="60"/>
       <w:r>
         <w:fldChar w:fldCharType="begin"/>
       </w:r>
@@ -9820,37 +9570,10 @@
         <w:t>The Member Scores</w:t>
       </w:r>
       <w:r>
-        <w:fldChar w:fldCharType="begin"/>
-      </w:r>
-      <w:r>
-        <w:instrText xml:space="preserve"> E "</w:instrText>
-      </w:r>
-      <w:r>
-        <w:instrText>Member Scores</w:instrText>
-      </w:r>
-      <w:r>
-        <w:instrText xml:space="preserve">" </w:instrText>
-      </w:r>
-      <w:r>
-        <w:fldChar w:fldCharType="end"/>
-      </w:r>
-      <w:r>
-        <w:fldChar w:fldCharType="begin"/>
-      </w:r>
-      <w:r>
-        <w:instrText>E "</w:instrText>
-      </w:r>
-      <w:r>
-        <w:instrText>Member Scores</w:instrText>
-      </w:r>
-      <w:r>
-        <w:instrText xml:space="preserve">" </w:instrText>
-      </w:r>
-      <w:r>
-        <w:fldChar w:fldCharType="end"/>
-      </w:r>
-      <w:r>
-        <w:t xml:space="preserve"> screen is where the members’ scores recaps are entered into the database. It’s also where tournaments are created and edited. In order to enter scores, a tournament must be created and selected.</w:t>
+        <w:t xml:space="preserve"> </w:t>
+      </w:r>
+      <w:r>
+        <w:t>screen is where the members’ scores recaps are entered into the database. It’s also where tournaments are created and edited. In order to enter scores, a tournament must be created and selected.</w:t>
       </w:r>
     </w:p>
     <w:p>
@@ -9862,40 +9585,7 @@
         </w:numPr>
       </w:pPr>
       <w:r>
-        <w:t>Enter Member Number</w:t>
-      </w:r>
-      <w:r>
-        <w:fldChar w:fldCharType="begin"/>
-      </w:r>
-      <w:r>
-        <w:instrText xml:space="preserve"> E "</w:instrText>
-      </w:r>
-      <w:r>
-        <w:instrText>Member Number</w:instrText>
-      </w:r>
-      <w:r>
-        <w:instrText xml:space="preserve">" </w:instrText>
-      </w:r>
-      <w:r>
-        <w:fldChar w:fldCharType="end"/>
-      </w:r>
-      <w:r>
-        <w:fldChar w:fldCharType="begin"/>
-      </w:r>
-      <w:r>
-        <w:instrText>E "</w:instrText>
-      </w:r>
-      <w:r>
-        <w:instrText>Member Number</w:instrText>
-      </w:r>
-      <w:r>
-        <w:instrText xml:space="preserve">" </w:instrText>
-      </w:r>
-      <w:r>
-        <w:fldChar w:fldCharType="end"/>
-      </w:r>
-      <w:r>
-        <w:t>—the bowler’s member number is entered here.</w:t>
+        <w:t>Enter Member Number—the bowler’s member number is entered here.</w:t>
       </w:r>
     </w:p>
     <w:p>
@@ -9907,25 +9597,7 @@
         </w:numPr>
       </w:pPr>
       <w:r>
-        <w:t>Last Name</w:t>
-      </w:r>
-      <w:r>
-        <w:fldChar w:fldCharType="begin"/>
-      </w:r>
-      <w:r>
-        <w:instrText>E "</w:instrText>
-      </w:r>
-      <w:r>
-        <w:instrText>Last Name</w:instrText>
-      </w:r>
-      <w:r>
-        <w:instrText xml:space="preserve">" </w:instrText>
-      </w:r>
-      <w:r>
-        <w:fldChar w:fldCharType="end"/>
-      </w:r>
-      <w:r>
-        <w:t>—after the member number is entered, this field auto-populates with the member’s last name.</w:t>
+        <w:t>Last Name—after the member number is entered, this field auto-populates with the member’s last name.</w:t>
       </w:r>
     </w:p>
     <w:p>
@@ -9937,25 +9609,7 @@
         </w:numPr>
       </w:pPr>
       <w:r>
-        <w:t>First Name</w:t>
-      </w:r>
-      <w:r>
-        <w:fldChar w:fldCharType="begin"/>
-      </w:r>
-      <w:r>
-        <w:instrText>E "</w:instrText>
-      </w:r>
-      <w:r>
-        <w:instrText>First Name</w:instrText>
-      </w:r>
-      <w:r>
-        <w:instrText xml:space="preserve">" </w:instrText>
-      </w:r>
-      <w:r>
-        <w:fldChar w:fldCharType="end"/>
-      </w:r>
-      <w:r>
-        <w:t>—after the member number is entered, this field auto populates with the member’s first name.</w:t>
+        <w:t>First Name—after the member number is entered, this field auto populates with the member’s first name.</w:t>
       </w:r>
     </w:p>
     <w:p>
@@ -9967,25 +9621,7 @@
         </w:numPr>
       </w:pPr>
       <w:r>
-        <w:t>Middle Initial</w:t>
-      </w:r>
-      <w:r>
-        <w:fldChar w:fldCharType="begin"/>
-      </w:r>
-      <w:r>
-        <w:instrText>E "</w:instrText>
-      </w:r>
-      <w:r>
-        <w:instrText>Middle Initial</w:instrText>
-      </w:r>
-      <w:r>
-        <w:instrText xml:space="preserve">" </w:instrText>
-      </w:r>
-      <w:r>
-        <w:fldChar w:fldCharType="end"/>
-      </w:r>
-      <w:r>
-        <w:t>—after the member is entered, this field auto populates with the member’s middle initial.</w:t>
+        <w:t>Middle Initial—after the member is entered, this field auto populates with the member’s middle initial.</w:t>
       </w:r>
     </w:p>
     <w:p>
@@ -9997,41 +9633,7 @@
         </w:numPr>
       </w:pPr>
       <w:r>
-        <w:lastRenderedPageBreak/>
-        <w:t>Squad Number</w:t>
-      </w:r>
-      <w:r>
-        <w:fldChar w:fldCharType="begin"/>
-      </w:r>
-      <w:r>
-        <w:instrText xml:space="preserve"> E "</w:instrText>
-      </w:r>
-      <w:r>
-        <w:instrText>Squad Number</w:instrText>
-      </w:r>
-      <w:r>
-        <w:instrText xml:space="preserve">" </w:instrText>
-      </w:r>
-      <w:r>
-        <w:fldChar w:fldCharType="end"/>
-      </w:r>
-      <w:r>
-        <w:fldChar w:fldCharType="begin"/>
-      </w:r>
-      <w:r>
-        <w:instrText>E "</w:instrText>
-      </w:r>
-      <w:r>
-        <w:instrText>Sq Number</w:instrText>
-      </w:r>
-      <w:r>
-        <w:instrText xml:space="preserve">" </w:instrText>
-      </w:r>
-      <w:r>
-        <w:fldChar w:fldCharType="end"/>
-      </w:r>
-      <w:r>
-        <w:t>—pick the squad the member bowled in for this tournament.</w:t>
+        <w:t>Squad Number—pick the squad the member bowled in for this tournament.</w:t>
       </w:r>
     </w:p>
     <w:p>
@@ -10043,55 +9645,7 @@
         </w:numPr>
       </w:pPr>
       <w:r>
-        <w:t>Member Status</w:t>
-      </w:r>
-      <w:r>
-        <w:fldChar w:fldCharType="begin"/>
-      </w:r>
-      <w:r>
-        <w:instrText xml:space="preserve"> E "</w:instrText>
-      </w:r>
-      <w:r>
-        <w:instrText>Member Status</w:instrText>
-      </w:r>
-      <w:r>
-        <w:instrText xml:space="preserve">" </w:instrText>
-      </w:r>
-      <w:r>
-        <w:fldChar w:fldCharType="end"/>
-      </w:r>
-      <w:r>
-        <w:fldChar w:fldCharType="begin"/>
-      </w:r>
-      <w:r>
-        <w:instrText xml:space="preserve"> E "</w:instrText>
-      </w:r>
-      <w:r>
-        <w:instrText>Member Status</w:instrText>
-      </w:r>
-      <w:r>
-        <w:instrText xml:space="preserve">" </w:instrText>
-      </w:r>
-      <w:r>
-        <w:fldChar w:fldCharType="end"/>
-      </w:r>
-      <w:r>
-        <w:fldChar w:fldCharType="begin"/>
-      </w:r>
-      <w:r>
-        <w:instrText>E "</w:instrText>
-      </w:r>
-      <w:r>
-        <w:instrText>Member Status</w:instrText>
-      </w:r>
-      <w:r>
-        <w:instrText xml:space="preserve">" </w:instrText>
-      </w:r>
-      <w:r>
-        <w:fldChar w:fldCharType="end"/>
-      </w:r>
-      <w:r>
-        <w:t>—after the member number is entered, this field auto-populates with the member’s active/inactive status. Scores can only be entered for an active member.</w:t>
+        <w:t>Member Status—after the member number is entered, this field auto-populates with the member’s active/inactive status. Scores can only be entered for an active member.</w:t>
       </w:r>
     </w:p>
     <w:p>
@@ -10121,21 +9675,6 @@
         <w:fldChar w:fldCharType="end"/>
       </w:r>
       <w:r>
-        <w:fldChar w:fldCharType="begin"/>
-      </w:r>
-      <w:r>
-        <w:instrText xml:space="preserve"> E "</w:instrText>
-      </w:r>
-      <w:r>
-        <w:instrText>Stats</w:instrText>
-      </w:r>
-      <w:r>
-        <w:instrText xml:space="preserve">" </w:instrText>
-      </w:r>
-      <w:r>
-        <w:fldChar w:fldCharType="end"/>
-      </w:r>
-      <w:r>
         <w:t xml:space="preserve"> section</w:t>
       </w:r>
     </w:p>
@@ -10166,21 +9705,6 @@
         <w:fldChar w:fldCharType="end"/>
       </w:r>
       <w:r>
-        <w:fldChar w:fldCharType="begin"/>
-      </w:r>
-      <w:r>
-        <w:instrText>E "</w:instrText>
-      </w:r>
-      <w:r>
-        <w:instrText>Scratch Scores</w:instrText>
-      </w:r>
-      <w:r>
-        <w:instrText xml:space="preserve">" </w:instrText>
-      </w:r>
-      <w:r>
-        <w:fldChar w:fldCharType="end"/>
-      </w:r>
-      <w:r>
         <w:t>—where the member’s four scratch scores are entered. The total is automatically calculated and displayed after the fourth score.</w:t>
       </w:r>
     </w:p>
@@ -10376,6 +9900,7 @@
         </w:numPr>
       </w:pPr>
       <w:r>
+        <w:lastRenderedPageBreak/>
         <w:t>High Game</w:t>
       </w:r>
       <w:r>
@@ -10484,16 +10009,11 @@
         </w:numPr>
       </w:pPr>
       <w:r>
-        <w:t xml:space="preserve">Qualify </w:t>
-      </w:r>
-      <w:proofErr w:type="gramStart"/>
-      <w:r>
-        <w:t>By Squad</w:t>
+        <w:t>Qualify By Squad</w:t>
       </w:r>
       <w:r>
         <w:fldChar w:fldCharType="begin"/>
       </w:r>
-      <w:proofErr w:type="gramEnd"/>
       <w:r>
         <w:instrText xml:space="preserve"> XE "</w:instrText>
       </w:r>
@@ -10591,7 +10111,6 @@
         </w:numPr>
       </w:pPr>
       <w:r>
-        <w:lastRenderedPageBreak/>
         <w:t>“&lt;”—this button goes one record back.</w:t>
       </w:r>
     </w:p>
@@ -10634,36 +10153,6 @@
         <w:fldChar w:fldCharType="end"/>
       </w:r>
       <w:r>
-        <w:fldChar w:fldCharType="begin"/>
-      </w:r>
-      <w:r>
-        <w:instrText xml:space="preserve"> E "</w:instrText>
-      </w:r>
-      <w:r>
-        <w:instrText>Tournament Stats</w:instrText>
-      </w:r>
-      <w:r>
-        <w:instrText xml:space="preserve">" </w:instrText>
-      </w:r>
-      <w:r>
-        <w:fldChar w:fldCharType="end"/>
-      </w:r>
-      <w:r>
-        <w:fldChar w:fldCharType="begin"/>
-      </w:r>
-      <w:r>
-        <w:instrText xml:space="preserve"> E "</w:instrText>
-      </w:r>
-      <w:r>
-        <w:instrText>Stats</w:instrText>
-      </w:r>
-      <w:r>
-        <w:instrText xml:space="preserve">" </w:instrText>
-      </w:r>
-      <w:r>
-        <w:fldChar w:fldCharType="end"/>
-      </w:r>
-      <w:r>
         <w:t>—this button displays the current tournament’s stats.</w:t>
       </w:r>
     </w:p>
@@ -10676,16 +10165,11 @@
         </w:numPr>
       </w:pPr>
       <w:r>
-        <w:t xml:space="preserve">Delete Member </w:t>
-      </w:r>
-      <w:proofErr w:type="gramStart"/>
-      <w:r>
-        <w:t>From Tournament</w:t>
+        <w:t>Delete Member From Tournament</w:t>
       </w:r>
       <w:r>
         <w:fldChar w:fldCharType="begin"/>
       </w:r>
-      <w:proofErr w:type="gramEnd"/>
       <w:r>
         <w:instrText xml:space="preserve"> XE "</w:instrText>
       </w:r>
@@ -10711,51 +10195,13 @@
         </w:numPr>
       </w:pPr>
       <w:r>
-        <w:t xml:space="preserve">Print </w:t>
-      </w:r>
-      <w:proofErr w:type="gramStart"/>
-      <w:r>
-        <w:t>Recaps</w:t>
+        <w:t>Print Recaps By Tournament</w:t>
       </w:r>
       <w:r>
         <w:fldChar w:fldCharType="begin"/>
       </w:r>
       <w:r>
-        <w:instrText xml:space="preserve"> E "</w:instrText>
-      </w:r>
-      <w:r>
-        <w:instrText>Print Recaps</w:instrText>
-      </w:r>
-      <w:r>
-        <w:instrText xml:space="preserve">" </w:instrText>
-      </w:r>
-      <w:r>
-        <w:fldChar w:fldCharType="end"/>
-      </w:r>
-      <w:r>
-        <w:t xml:space="preserve"> By Tournament</w:t>
-      </w:r>
-      <w:r>
-        <w:fldChar w:fldCharType="begin"/>
-      </w:r>
-      <w:proofErr w:type="gramEnd"/>
-      <w:r>
         <w:instrText xml:space="preserve"> XE "</w:instrText>
-      </w:r>
-      <w:r>
-        <w:instrText>Print Recaps By Tournament</w:instrText>
-      </w:r>
-      <w:r>
-        <w:instrText xml:space="preserve">" </w:instrText>
-      </w:r>
-      <w:r>
-        <w:fldChar w:fldCharType="end"/>
-      </w:r>
-      <w:r>
-        <w:fldChar w:fldCharType="begin"/>
-      </w:r>
-      <w:r>
-        <w:instrText xml:space="preserve"> E "</w:instrText>
       </w:r>
       <w:r>
         <w:instrText>Print Recaps By Tournament</w:instrText>
@@ -10899,6 +10345,7 @@
         </w:numPr>
       </w:pPr>
       <w:r>
+        <w:lastRenderedPageBreak/>
         <w:t>Search Tournaments</w:t>
       </w:r>
       <w:r>
@@ -10929,16 +10376,11 @@
         </w:numPr>
       </w:pPr>
       <w:r>
-        <w:t xml:space="preserve">List Tournaments </w:t>
-      </w:r>
-      <w:proofErr w:type="gramStart"/>
-      <w:r>
-        <w:t>By Year</w:t>
+        <w:t>List Tournaments By Year</w:t>
       </w:r>
       <w:r>
         <w:fldChar w:fldCharType="begin"/>
       </w:r>
-      <w:proofErr w:type="gramEnd"/>
       <w:r>
         <w:instrText xml:space="preserve"> XE "</w:instrText>
       </w:r>
@@ -10982,46 +10424,13 @@
         <w:fldChar w:fldCharType="end"/>
       </w:r>
       <w:r>
-        <w:t xml:space="preserve"> Section. The buttons here launch the Member Scores</w:t>
+        <w:t xml:space="preserve"> Section. The buttons here launch the Member Scores Reports</w:t>
       </w:r>
       <w:r>
         <w:fldChar w:fldCharType="begin"/>
       </w:r>
       <w:r>
-        <w:instrText xml:space="preserve"> E "</w:instrText>
-      </w:r>
-      <w:r>
-        <w:instrText>Member Scores</w:instrText>
-      </w:r>
-      <w:r>
-        <w:instrText xml:space="preserve">" </w:instrText>
-      </w:r>
-      <w:r>
-        <w:fldChar w:fldCharType="end"/>
-      </w:r>
-      <w:r>
-        <w:t xml:space="preserve"> Reports</w:t>
-      </w:r>
-      <w:r>
-        <w:fldChar w:fldCharType="begin"/>
-      </w:r>
-      <w:r>
         <w:instrText xml:space="preserve"> XE "</w:instrText>
-      </w:r>
-      <w:r>
-        <w:instrText>Member Scores Reports</w:instrText>
-      </w:r>
-      <w:r>
-        <w:instrText xml:space="preserve">" </w:instrText>
-      </w:r>
-      <w:r>
-        <w:fldChar w:fldCharType="end"/>
-      </w:r>
-      <w:r>
-        <w:fldChar w:fldCharType="begin"/>
-      </w:r>
-      <w:r>
-        <w:instrText xml:space="preserve"> E "</w:instrText>
       </w:r>
       <w:r>
         <w:instrText>Member Scores Reports</w:instrText>
@@ -11141,7 +10550,6 @@
         </w:numPr>
       </w:pPr>
       <w:r>
-        <w:lastRenderedPageBreak/>
         <w:t>Finalize Tournament</w:t>
       </w:r>
       <w:r>
@@ -11167,13 +10575,48 @@
       <w:pPr>
         <w:pStyle w:val="Heading2"/>
       </w:pPr>
-      <w:bookmarkStart w:id="61" w:name="_Toc508962078"/>
-      <w:bookmarkStart w:id="62" w:name="_Toc509239625"/>
+      <w:bookmarkStart w:id="60" w:name="_Toc508962078"/>
+      <w:bookmarkStart w:id="61" w:name="_Toc509239625"/>
       <w:r>
         <w:t>Tools</w:t>
       </w:r>
+      <w:bookmarkEnd w:id="60"/>
       <w:bookmarkEnd w:id="61"/>
+      <w:r>
+        <w:fldChar w:fldCharType="begin"/>
+      </w:r>
+      <w:r>
+        <w:instrText xml:space="preserve"> XE "</w:instrText>
+      </w:r>
+      <w:r>
+        <w:instrText>Tools</w:instrText>
+      </w:r>
+      <w:r>
+        <w:instrText xml:space="preserve">" </w:instrText>
+      </w:r>
+      <w:r>
+        <w:fldChar w:fldCharType="end"/>
+      </w:r>
+    </w:p>
+    <w:p>
+      <w:pPr>
+        <w:pStyle w:val="BodyText"/>
+      </w:pPr>
+      <w:r>
+        <w:t>The update member status screen is launched from the tools tab.</w:t>
+      </w:r>
+    </w:p>
+    <w:p>
+      <w:pPr>
+        <w:pStyle w:val="Heading2"/>
+      </w:pPr>
+      <w:bookmarkStart w:id="62" w:name="_Toc508962079"/>
+      <w:bookmarkStart w:id="63" w:name="_Toc509239626"/>
+      <w:r>
+        <w:t>About</w:t>
+      </w:r>
       <w:bookmarkEnd w:id="62"/>
+      <w:bookmarkEnd w:id="63"/>
       <w:r>
         <w:fldChar w:fldCharType="begin"/>
       </w:r>
@@ -11181,7 +10624,7 @@
         <w:instrText xml:space="preserve"> XE "</w:instrText>
       </w:r>
       <w:r>
-        <w:instrText>Tools</w:instrText>
+        <w:instrText>About</w:instrText>
       </w:r>
       <w:r>
         <w:instrText xml:space="preserve">" </w:instrText>
@@ -11195,20 +10638,41 @@
         <w:pStyle w:val="BodyText"/>
       </w:pPr>
       <w:r>
-        <w:t>The update member status screen is launched from the tools tab.</w:t>
+        <w:t>Clicking the “About” button on the Main Menu</w:t>
+      </w:r>
+      <w:r>
+        <w:fldChar w:fldCharType="begin"/>
+      </w:r>
+      <w:r>
+        <w:instrText xml:space="preserve"> XE "</w:instrText>
+      </w:r>
+      <w:r>
+        <w:rPr>
+          <w:szCs w:val="32"/>
+        </w:rPr>
+        <w:instrText>Main Menu</w:instrText>
+      </w:r>
+      <w:r>
+        <w:instrText xml:space="preserve">" </w:instrText>
+      </w:r>
+      <w:r>
+        <w:fldChar w:fldCharType="end"/>
+      </w:r>
+      <w:r>
+        <w:t xml:space="preserve"> launches the About 9-Tap screen.</w:t>
       </w:r>
     </w:p>
     <w:p>
       <w:pPr>
         <w:pStyle w:val="Heading2"/>
       </w:pPr>
-      <w:bookmarkStart w:id="63" w:name="_Toc508962079"/>
-      <w:bookmarkStart w:id="64" w:name="_Toc509239626"/>
-      <w:r>
-        <w:t>About</w:t>
-      </w:r>
-      <w:bookmarkEnd w:id="63"/>
+      <w:bookmarkStart w:id="64" w:name="_Toc508962080"/>
+      <w:bookmarkStart w:id="65" w:name="_Toc509239627"/>
+      <w:r>
+        <w:t>Exit</w:t>
+      </w:r>
       <w:bookmarkEnd w:id="64"/>
+      <w:bookmarkEnd w:id="65"/>
       <w:r>
         <w:fldChar w:fldCharType="begin"/>
       </w:r>
@@ -11216,7 +10680,7 @@
         <w:instrText xml:space="preserve"> XE "</w:instrText>
       </w:r>
       <w:r>
-        <w:instrText>About</w:instrText>
+        <w:instrText>Exit</w:instrText>
       </w:r>
       <w:r>
         <w:instrText xml:space="preserve">" </w:instrText>
@@ -11230,7 +10694,7 @@
         <w:pStyle w:val="BodyText"/>
       </w:pPr>
       <w:r>
-        <w:t>Clicking the “About” button on the Main Menu</w:t>
+        <w:t>Clicking the “Exit</w:t>
       </w:r>
       <w:r>
         <w:fldChar w:fldCharType="begin"/>
@@ -11239,10 +10703,7 @@
         <w:instrText xml:space="preserve"> XE "</w:instrText>
       </w:r>
       <w:r>
-        <w:rPr>
-          <w:szCs w:val="32"/>
-        </w:rPr>
-        <w:instrText>Main Menu</w:instrText>
+        <w:instrText>Exit</w:instrText>
       </w:r>
       <w:r>
         <w:instrText xml:space="preserve">" </w:instrText>
@@ -11251,79 +10712,18 @@
         <w:fldChar w:fldCharType="end"/>
       </w:r>
       <w:r>
-        <w:t xml:space="preserve"> launches the </w:t>
-      </w:r>
-      <w:proofErr w:type="gramStart"/>
-      <w:r>
-        <w:t>About</w:t>
-      </w:r>
-      <w:proofErr w:type="gramEnd"/>
-      <w:r>
-        <w:t xml:space="preserve"> 9-Tap screen.</w:t>
+        <w:t>” button exits the program.</w:t>
       </w:r>
     </w:p>
     <w:p>
       <w:pPr>
         <w:pStyle w:val="Heading2"/>
       </w:pPr>
-      <w:bookmarkStart w:id="65" w:name="_Toc508962080"/>
-      <w:bookmarkStart w:id="66" w:name="_Toc509239627"/>
-      <w:r>
-        <w:t>Exit</w:t>
-      </w:r>
-      <w:bookmarkEnd w:id="65"/>
+      <w:bookmarkStart w:id="66" w:name="_Toc509239628"/>
+      <w:r>
+        <w:t>Import Member Data</w:t>
+      </w:r>
       <w:bookmarkEnd w:id="66"/>
-      <w:r>
-        <w:fldChar w:fldCharType="begin"/>
-      </w:r>
-      <w:r>
-        <w:instrText xml:space="preserve"> XE "</w:instrText>
-      </w:r>
-      <w:r>
-        <w:instrText>Exit</w:instrText>
-      </w:r>
-      <w:r>
-        <w:instrText xml:space="preserve">" </w:instrText>
-      </w:r>
-      <w:r>
-        <w:fldChar w:fldCharType="end"/>
-      </w:r>
-    </w:p>
-    <w:p>
-      <w:pPr>
-        <w:pStyle w:val="BodyText"/>
-      </w:pPr>
-      <w:r>
-        <w:t>Clicking the “Exit</w:t>
-      </w:r>
-      <w:r>
-        <w:fldChar w:fldCharType="begin"/>
-      </w:r>
-      <w:r>
-        <w:instrText xml:space="preserve"> XE "</w:instrText>
-      </w:r>
-      <w:r>
-        <w:instrText>Exit</w:instrText>
-      </w:r>
-      <w:r>
-        <w:instrText xml:space="preserve">" </w:instrText>
-      </w:r>
-      <w:r>
-        <w:fldChar w:fldCharType="end"/>
-      </w:r>
-      <w:r>
-        <w:t>” button exits the program.</w:t>
-      </w:r>
-    </w:p>
-    <w:p>
-      <w:pPr>
-        <w:pStyle w:val="Heading2"/>
-      </w:pPr>
-      <w:bookmarkStart w:id="67" w:name="_Toc509239628"/>
-      <w:r>
-        <w:t>Import Member Data</w:t>
-      </w:r>
-      <w:bookmarkEnd w:id="67"/>
     </w:p>
     <w:p>
       <w:pPr>
@@ -11336,18 +10736,18 @@
     <w:p>
       <w:pPr>
         <w:sectPr>
-          <w:headerReference w:type="default" r:id="rId36"/>
-          <w:footerReference w:type="default" r:id="rId37"/>
-          <w:headerReference w:type="first" r:id="rId38"/>
+          <w:headerReference w:type="default" r:id="rId40"/>
+          <w:footerReference w:type="default" r:id="rId41"/>
+          <w:headerReference w:type="first" r:id="rId42"/>
           <w:type w:val="continuous"/>
           <w:pgSz w:w="12240" w:h="15840" w:code="1"/>
           <w:pgMar w:top="1800" w:right="1195" w:bottom="1440" w:left="3355" w:header="720" w:footer="720" w:gutter="0"/>
           <w:cols w:space="720"/>
         </w:sectPr>
       </w:pPr>
-      <w:bookmarkStart w:id="68" w:name="_Toc35154388"/>
-      <w:bookmarkStart w:id="69" w:name="_Toc35154911"/>
-      <w:bookmarkStart w:id="70" w:name="_Toc36023011"/>
+      <w:bookmarkStart w:id="67" w:name="_Toc35154388"/>
+      <w:bookmarkStart w:id="68" w:name="_Toc35154911"/>
+      <w:bookmarkStart w:id="69" w:name="_Toc36023011"/>
     </w:p>
     <w:p>
       <w:pPr>
@@ -11356,15 +10756,15 @@
           <w:noProof/>
         </w:rPr>
       </w:pPr>
-      <w:bookmarkStart w:id="71" w:name="_Toc508962081"/>
+      <w:bookmarkStart w:id="70" w:name="_Toc508962081"/>
       <w:r>
         <w:lastRenderedPageBreak/>
         <w:t>Index</w:t>
       </w:r>
+      <w:bookmarkEnd w:id="67"/>
       <w:bookmarkEnd w:id="68"/>
       <w:bookmarkEnd w:id="69"/>
       <w:bookmarkEnd w:id="70"/>
-      <w:bookmarkEnd w:id="71"/>
       <w:r>
         <w:fldChar w:fldCharType="begin"/>
       </w:r>
@@ -11382,9 +10782,9 @@
           <w:noProof/>
         </w:rPr>
         <w:sectPr>
-          <w:headerReference w:type="default" r:id="rId39"/>
-          <w:footerReference w:type="default" r:id="rId40"/>
-          <w:headerReference w:type="first" r:id="rId41"/>
+          <w:headerReference w:type="default" r:id="rId43"/>
+          <w:footerReference w:type="default" r:id="rId44"/>
+          <w:headerReference w:type="first" r:id="rId45"/>
           <w:pgSz w:w="12240" w:h="15840"/>
           <w:pgMar w:top="1440" w:right="1440" w:bottom="1440" w:left="1440" w:header="720" w:footer="720" w:gutter="0"/>
           <w:cols w:space="720"/>
@@ -12258,6 +11658,16 @@
 </file>
 
 <file path=word/footer1.xml><?xml version="1.0" encoding="utf-8"?>
+<w:ftr xmlns:wpc="http://schemas.microsoft.com/office/word/2010/wordprocessingCanvas" xmlns:mc="http://schemas.openxmlformats.org/markup-compatibility/2006" xmlns:o="urn:schemas-microsoft-com:office:office" xmlns:r="http://schemas.openxmlformats.org/officeDocument/2006/relationships" xmlns:m="http://schemas.openxmlformats.org/officeDocument/2006/math" xmlns:v="urn:schemas-microsoft-com:vml" xmlns:wp14="http://schemas.microsoft.com/office/word/2010/wordprocessingDrawing" xmlns:wp="http://schemas.openxmlformats.org/drawingml/2006/wordprocessingDrawing" xmlns:w10="urn:schemas-microsoft-com:office:word" xmlns:w="http://schemas.openxmlformats.org/wordprocessingml/2006/main" xmlns:w14="http://schemas.microsoft.com/office/word/2010/wordml" xmlns:w15="http://schemas.microsoft.com/office/word/2012/wordml" xmlns:wpg="http://schemas.microsoft.com/office/word/2010/wordprocessingGroup" xmlns:wpi="http://schemas.microsoft.com/office/word/2010/wordprocessingInk" xmlns:wne="http://schemas.microsoft.com/office/word/2006/wordml" xmlns:wps="http://schemas.microsoft.com/office/word/2010/wordprocessingShape" mc:Ignorable="w14 w15 wp14">
+  <w:p>
+    <w:pPr>
+      <w:pStyle w:val="Footer"/>
+    </w:pPr>
+  </w:p>
+</w:ftr>
+</file>
+
+<file path=word/footer2.xml><?xml version="1.0" encoding="utf-8"?>
 <w:ftr xmlns:wpc="http://schemas.microsoft.com/office/word/2010/wordprocessingCanvas" xmlns:mc="http://schemas.openxmlformats.org/markup-compatibility/2006" xmlns:o="urn:schemas-microsoft-com:office:office" xmlns:r="http://schemas.openxmlformats.org/officeDocument/2006/relationships" xmlns:m="http://schemas.openxmlformats.org/officeDocument/2006/math" xmlns:v="urn:schemas-microsoft-com:vml" xmlns:wp14="http://schemas.microsoft.com/office/word/2010/wordprocessingDrawing" xmlns:wp="http://schemas.openxmlformats.org/drawingml/2006/wordprocessingDrawing" xmlns:w10="urn:schemas-microsoft-com:office:word" xmlns:w="http://schemas.openxmlformats.org/wordprocessingml/2006/main" xmlns:w14="http://schemas.microsoft.com/office/word/2010/wordml" xmlns:w15="http://schemas.microsoft.com/office/word/2012/wordml" xmlns:wpg="http://schemas.microsoft.com/office/word/2010/wordprocessingGroup" xmlns:wpi="http://schemas.microsoft.com/office/word/2010/wordprocessingInk" xmlns:wne="http://schemas.microsoft.com/office/word/2006/wordml" xmlns:wps="http://schemas.microsoft.com/office/word/2010/wordprocessingShape" mc:Ignorable="w14 w15 wp14">
   <w:p>
     <w:pPr>
@@ -12298,16 +11708,6 @@
 </w:ftr>
 </file>
 
-<file path=word/footer2.xml><?xml version="1.0" encoding="utf-8"?>
-<w:ftr xmlns:wpc="http://schemas.microsoft.com/office/word/2010/wordprocessingCanvas" xmlns:mc="http://schemas.openxmlformats.org/markup-compatibility/2006" xmlns:o="urn:schemas-microsoft-com:office:office" xmlns:r="http://schemas.openxmlformats.org/officeDocument/2006/relationships" xmlns:m="http://schemas.openxmlformats.org/officeDocument/2006/math" xmlns:v="urn:schemas-microsoft-com:vml" xmlns:wp14="http://schemas.microsoft.com/office/word/2010/wordprocessingDrawing" xmlns:wp="http://schemas.openxmlformats.org/drawingml/2006/wordprocessingDrawing" xmlns:w10="urn:schemas-microsoft-com:office:word" xmlns:w="http://schemas.openxmlformats.org/wordprocessingml/2006/main" xmlns:w14="http://schemas.microsoft.com/office/word/2010/wordml" xmlns:w15="http://schemas.microsoft.com/office/word/2012/wordml" xmlns:wpg="http://schemas.microsoft.com/office/word/2010/wordprocessingGroup" xmlns:wpi="http://schemas.microsoft.com/office/word/2010/wordprocessingInk" xmlns:wne="http://schemas.microsoft.com/office/word/2006/wordml" xmlns:wps="http://schemas.microsoft.com/office/word/2010/wordprocessingShape" mc:Ignorable="w14 w15 wp14">
-  <w:p>
-    <w:pPr>
-      <w:pStyle w:val="Footer"/>
-    </w:pPr>
-  </w:p>
-</w:ftr>
-</file>
-
 <file path=word/footer3.xml><?xml version="1.0" encoding="utf-8"?>
 <w:ftr xmlns:wpc="http://schemas.microsoft.com/office/word/2010/wordprocessingCanvas" xmlns:mc="http://schemas.openxmlformats.org/markup-compatibility/2006" xmlns:o="urn:schemas-microsoft-com:office:office" xmlns:r="http://schemas.openxmlformats.org/officeDocument/2006/relationships" xmlns:m="http://schemas.openxmlformats.org/officeDocument/2006/math" xmlns:v="urn:schemas-microsoft-com:vml" xmlns:wp14="http://schemas.microsoft.com/office/word/2010/wordprocessingDrawing" xmlns:wp="http://schemas.openxmlformats.org/drawingml/2006/wordprocessingDrawing" xmlns:w10="urn:schemas-microsoft-com:office:word" xmlns:w="http://schemas.openxmlformats.org/wordprocessingml/2006/main" xmlns:w14="http://schemas.microsoft.com/office/word/2010/wordml" xmlns:w15="http://schemas.microsoft.com/office/word/2012/wordml" xmlns:wpg="http://schemas.microsoft.com/office/word/2010/wordprocessingGroup" xmlns:wpi="http://schemas.microsoft.com/office/word/2010/wordprocessingInk" xmlns:wne="http://schemas.microsoft.com/office/word/2006/wordml" xmlns:wps="http://schemas.microsoft.com/office/word/2010/wordprocessingShape" mc:Ignorable="w14 w15 wp14">
   <w:p>
@@ -12319,6 +11719,26 @@
 </file>
 
 <file path=word/footer4.xml><?xml version="1.0" encoding="utf-8"?>
+<w:ftr xmlns:wpc="http://schemas.microsoft.com/office/word/2010/wordprocessingCanvas" xmlns:mc="http://schemas.openxmlformats.org/markup-compatibility/2006" xmlns:o="urn:schemas-microsoft-com:office:office" xmlns:r="http://schemas.openxmlformats.org/officeDocument/2006/relationships" xmlns:m="http://schemas.openxmlformats.org/officeDocument/2006/math" xmlns:v="urn:schemas-microsoft-com:vml" xmlns:wp14="http://schemas.microsoft.com/office/word/2010/wordprocessingDrawing" xmlns:wp="http://schemas.openxmlformats.org/drawingml/2006/wordprocessingDrawing" xmlns:w10="urn:schemas-microsoft-com:office:word" xmlns:w="http://schemas.openxmlformats.org/wordprocessingml/2006/main" xmlns:w14="http://schemas.microsoft.com/office/word/2010/wordml" xmlns:w15="http://schemas.microsoft.com/office/word/2012/wordml" xmlns:wpg="http://schemas.microsoft.com/office/word/2010/wordprocessingGroup" xmlns:wpi="http://schemas.microsoft.com/office/word/2010/wordprocessingInk" xmlns:wne="http://schemas.microsoft.com/office/word/2006/wordml" xmlns:wps="http://schemas.microsoft.com/office/word/2010/wordprocessingShape" mc:Ignorable="w14 w15 wp14">
+  <w:p>
+    <w:pPr>
+      <w:pStyle w:val="Footer"/>
+    </w:pPr>
+  </w:p>
+</w:ftr>
+</file>
+
+<file path=word/footer5.xml><?xml version="1.0" encoding="utf-8"?>
+<w:ftr xmlns:wpc="http://schemas.microsoft.com/office/word/2010/wordprocessingCanvas" xmlns:mc="http://schemas.openxmlformats.org/markup-compatibility/2006" xmlns:o="urn:schemas-microsoft-com:office:office" xmlns:r="http://schemas.openxmlformats.org/officeDocument/2006/relationships" xmlns:m="http://schemas.openxmlformats.org/officeDocument/2006/math" xmlns:v="urn:schemas-microsoft-com:vml" xmlns:wp14="http://schemas.microsoft.com/office/word/2010/wordprocessingDrawing" xmlns:wp="http://schemas.openxmlformats.org/drawingml/2006/wordprocessingDrawing" xmlns:w10="urn:schemas-microsoft-com:office:word" xmlns:w="http://schemas.openxmlformats.org/wordprocessingml/2006/main" xmlns:w14="http://schemas.microsoft.com/office/word/2010/wordml" xmlns:w15="http://schemas.microsoft.com/office/word/2012/wordml" xmlns:wpg="http://schemas.microsoft.com/office/word/2010/wordprocessingGroup" xmlns:wpi="http://schemas.microsoft.com/office/word/2010/wordprocessingInk" xmlns:wne="http://schemas.microsoft.com/office/word/2006/wordml" xmlns:wps="http://schemas.microsoft.com/office/word/2010/wordprocessingShape" mc:Ignorable="w14 w15 wp14">
+  <w:p>
+    <w:pPr>
+      <w:pStyle w:val="Footer"/>
+    </w:pPr>
+  </w:p>
+</w:ftr>
+</file>
+
+<file path=word/footer6.xml><?xml version="1.0" encoding="utf-8"?>
 <w:ftr xmlns:wpc="http://schemas.microsoft.com/office/word/2010/wordprocessingCanvas" xmlns:mc="http://schemas.openxmlformats.org/markup-compatibility/2006" xmlns:o="urn:schemas-microsoft-com:office:office" xmlns:r="http://schemas.openxmlformats.org/officeDocument/2006/relationships" xmlns:m="http://schemas.openxmlformats.org/officeDocument/2006/math" xmlns:v="urn:schemas-microsoft-com:vml" xmlns:wp14="http://schemas.microsoft.com/office/word/2010/wordprocessingDrawing" xmlns:wp="http://schemas.openxmlformats.org/drawingml/2006/wordprocessingDrawing" xmlns:w10="urn:schemas-microsoft-com:office:word" xmlns:w="http://schemas.openxmlformats.org/wordprocessingml/2006/main" xmlns:w14="http://schemas.microsoft.com/office/word/2010/wordml" xmlns:w15="http://schemas.microsoft.com/office/word/2012/wordml" xmlns:wpg="http://schemas.microsoft.com/office/word/2010/wordprocessingGroup" xmlns:wpi="http://schemas.microsoft.com/office/word/2010/wordprocessingInk" xmlns:wne="http://schemas.microsoft.com/office/word/2006/wordml" xmlns:wps="http://schemas.microsoft.com/office/word/2010/wordprocessingShape" mc:Ignorable="w14 w15 wp14">
   <w:sdt>
     <w:sdtPr>
@@ -12351,7 +11771,7 @@
           <w:rPr>
             <w:noProof/>
           </w:rPr>
-          <w:t>19</w:t>
+          <w:t>31</w:t>
         </w:r>
         <w:r>
           <w:rPr>
@@ -12365,103 +11785,99 @@
 </w:ftr>
 </file>
 
-<file path=word/footer5.xml><?xml version="1.0" encoding="utf-8"?>
+<file path=word/footer7.xml><?xml version="1.0" encoding="utf-8"?>
 <w:ftr xmlns:wpc="http://schemas.microsoft.com/office/word/2010/wordprocessingCanvas" xmlns:mc="http://schemas.openxmlformats.org/markup-compatibility/2006" xmlns:o="urn:schemas-microsoft-com:office:office" xmlns:r="http://schemas.openxmlformats.org/officeDocument/2006/relationships" xmlns:m="http://schemas.openxmlformats.org/officeDocument/2006/math" xmlns:v="urn:schemas-microsoft-com:vml" xmlns:wp14="http://schemas.microsoft.com/office/word/2010/wordprocessingDrawing" xmlns:wp="http://schemas.openxmlformats.org/drawingml/2006/wordprocessingDrawing" xmlns:w10="urn:schemas-microsoft-com:office:word" xmlns:w="http://schemas.openxmlformats.org/wordprocessingml/2006/main" xmlns:w14="http://schemas.microsoft.com/office/word/2010/wordml" xmlns:w15="http://schemas.microsoft.com/office/word/2012/wordml" xmlns:wpg="http://schemas.microsoft.com/office/word/2010/wordprocessingGroup" xmlns:wpi="http://schemas.microsoft.com/office/word/2010/wordprocessingInk" xmlns:wne="http://schemas.microsoft.com/office/word/2006/wordml" xmlns:wps="http://schemas.microsoft.com/office/word/2010/wordprocessingShape" mc:Ignorable="w14 w15 wp14">
-  <w:p>
-    <w:pPr>
-      <w:pStyle w:val="Footer"/>
-      <w:framePr w:wrap="notBeside" w:vAnchor="text" w:hAnchor="margin" w:xAlign="center" w:y="1"/>
+  <w:sdt>
+    <w:sdtPr>
+      <w:id w:val="-1194223170"/>
+      <w:docPartObj>
+        <w:docPartGallery w:val="Page Numbers (Bottom of Page)"/>
+        <w:docPartUnique/>
+      </w:docPartObj>
+    </w:sdtPr>
+    <w:sdtEndPr>
       <w:rPr>
-        <w:rStyle w:val="PageNumber"/>
-      </w:rPr>
-    </w:pPr>
-    <w:r>
-      <w:rPr>
-        <w:rStyle w:val="PageNumber"/>
-      </w:rPr>
-      <w:fldChar w:fldCharType="begin"/>
-    </w:r>
-    <w:r>
-      <w:rPr>
-        <w:rStyle w:val="PageNumber"/>
-      </w:rPr>
-      <w:instrText xml:space="preserve">PAGE  </w:instrText>
-    </w:r>
-    <w:r>
-      <w:rPr>
-        <w:rStyle w:val="PageNumber"/>
-      </w:rPr>
-      <w:fldChar w:fldCharType="separate"/>
-    </w:r>
-    <w:r>
-      <w:rPr>
-        <w:rStyle w:val="PageNumber"/>
         <w:noProof/>
       </w:rPr>
-      <w:t>36</w:t>
-    </w:r>
-    <w:r>
-      <w:rPr>
-        <w:rStyle w:val="PageNumber"/>
-      </w:rPr>
-      <w:fldChar w:fldCharType="end"/>
-    </w:r>
-  </w:p>
-  <w:p>
-    <w:pPr>
-      <w:pStyle w:val="Footer"/>
-    </w:pPr>
-  </w:p>
+    </w:sdtEndPr>
+    <w:sdtContent>
+      <w:p>
+        <w:pPr>
+          <w:pStyle w:val="Footer"/>
+        </w:pPr>
+        <w:r>
+          <w:fldChar w:fldCharType="begin"/>
+        </w:r>
+        <w:r>
+          <w:instrText xml:space="preserve"> PAGE   \* MERGEFORMAT </w:instrText>
+        </w:r>
+        <w:r>
+          <w:fldChar w:fldCharType="separate"/>
+        </w:r>
+        <w:r>
+          <w:rPr>
+            <w:noProof/>
+          </w:rPr>
+          <w:t>36</w:t>
+        </w:r>
+        <w:r>
+          <w:rPr>
+            <w:noProof/>
+          </w:rPr>
+          <w:fldChar w:fldCharType="end"/>
+        </w:r>
+      </w:p>
+    </w:sdtContent>
+  </w:sdt>
 </w:ftr>
 </file>
 
-<file path=word/footer6.xml><?xml version="1.0" encoding="utf-8"?>
+<file path=word/footer8.xml><?xml version="1.0" encoding="utf-8"?>
 <w:ftr xmlns:wpc="http://schemas.microsoft.com/office/word/2010/wordprocessingCanvas" xmlns:mc="http://schemas.openxmlformats.org/markup-compatibility/2006" xmlns:o="urn:schemas-microsoft-com:office:office" xmlns:r="http://schemas.openxmlformats.org/officeDocument/2006/relationships" xmlns:m="http://schemas.openxmlformats.org/officeDocument/2006/math" xmlns:v="urn:schemas-microsoft-com:vml" xmlns:wp14="http://schemas.microsoft.com/office/word/2010/wordprocessingDrawing" xmlns:wp="http://schemas.openxmlformats.org/drawingml/2006/wordprocessingDrawing" xmlns:w10="urn:schemas-microsoft-com:office:word" xmlns:w="http://schemas.openxmlformats.org/wordprocessingml/2006/main" xmlns:w14="http://schemas.microsoft.com/office/word/2010/wordml" xmlns:w15="http://schemas.microsoft.com/office/word/2012/wordml" xmlns:wpg="http://schemas.microsoft.com/office/word/2010/wordprocessingGroup" xmlns:wpi="http://schemas.microsoft.com/office/word/2010/wordprocessingInk" xmlns:wne="http://schemas.microsoft.com/office/word/2006/wordml" xmlns:wps="http://schemas.microsoft.com/office/word/2010/wordprocessingShape" mc:Ignorable="w14 w15 wp14">
-  <w:p>
-    <w:pPr>
-      <w:pStyle w:val="Footer"/>
-      <w:framePr w:wrap="notBeside" w:vAnchor="text" w:hAnchor="margin" w:xAlign="center" w:y="1"/>
+  <w:sdt>
+    <w:sdtPr>
+      <w:id w:val="1105846419"/>
+      <w:docPartObj>
+        <w:docPartGallery w:val="Page Numbers (Bottom of Page)"/>
+        <w:docPartUnique/>
+      </w:docPartObj>
+    </w:sdtPr>
+    <w:sdtEndPr>
       <w:rPr>
-        <w:rStyle w:val="PageNumber"/>
-      </w:rPr>
-    </w:pPr>
-    <w:r>
-      <w:rPr>
-        <w:rStyle w:val="PageNumber"/>
-      </w:rPr>
-      <w:fldChar w:fldCharType="begin"/>
-    </w:r>
-    <w:r>
-      <w:rPr>
-        <w:rStyle w:val="PageNumber"/>
-      </w:rPr>
-      <w:instrText xml:space="preserve">PAGE  </w:instrText>
-    </w:r>
-    <w:r>
-      <w:rPr>
-        <w:rStyle w:val="PageNumber"/>
-      </w:rPr>
-      <w:fldChar w:fldCharType="separate"/>
-    </w:r>
-    <w:r>
-      <w:rPr>
-        <w:rStyle w:val="PageNumber"/>
         <w:noProof/>
       </w:rPr>
-      <w:t>37</w:t>
-    </w:r>
-    <w:r>
-      <w:rPr>
-        <w:rStyle w:val="PageNumber"/>
-      </w:rPr>
-      <w:fldChar w:fldCharType="end"/>
-    </w:r>
-  </w:p>
-  <w:p>
-    <w:pPr>
-      <w:pStyle w:val="Footer"/>
-    </w:pPr>
-  </w:p>
+    </w:sdtEndPr>
+    <w:sdtContent>
+      <w:p>
+        <w:pPr>
+          <w:pStyle w:val="Footer"/>
+        </w:pPr>
+        <w:r>
+          <w:fldChar w:fldCharType="begin"/>
+        </w:r>
+        <w:r>
+          <w:instrText xml:space="preserve"> PAGE   \* MERGEFORMAT </w:instrText>
+        </w:r>
+        <w:r>
+          <w:fldChar w:fldCharType="separate"/>
+        </w:r>
+        <w:r>
+          <w:rPr>
+            <w:noProof/>
+          </w:rPr>
+          <w:t>37</w:t>
+        </w:r>
+        <w:r>
+          <w:rPr>
+            <w:noProof/>
+          </w:rPr>
+          <w:fldChar w:fldCharType="end"/>
+        </w:r>
+      </w:p>
+    </w:sdtContent>
+  </w:sdt>
+  <w:bookmarkStart w:id="71" w:name="_GoBack" w:displacedByCustomXml="prev"/>
+  <w:bookmarkEnd w:id="71" w:displacedByCustomXml="prev"/>
 </w:ftr>
 </file>
 
@@ -12485,6 +11901,26 @@
 </file>
 
 <file path=word/header1.xml><?xml version="1.0" encoding="utf-8"?>
+<w:hdr xmlns:wpc="http://schemas.microsoft.com/office/word/2010/wordprocessingCanvas" xmlns:mc="http://schemas.openxmlformats.org/markup-compatibility/2006" xmlns:o="urn:schemas-microsoft-com:office:office" xmlns:r="http://schemas.openxmlformats.org/officeDocument/2006/relationships" xmlns:m="http://schemas.openxmlformats.org/officeDocument/2006/math" xmlns:v="urn:schemas-microsoft-com:vml" xmlns:wp14="http://schemas.microsoft.com/office/word/2010/wordprocessingDrawing" xmlns:wp="http://schemas.openxmlformats.org/drawingml/2006/wordprocessingDrawing" xmlns:w10="urn:schemas-microsoft-com:office:word" xmlns:w="http://schemas.openxmlformats.org/wordprocessingml/2006/main" xmlns:w14="http://schemas.microsoft.com/office/word/2010/wordml" xmlns:w15="http://schemas.microsoft.com/office/word/2012/wordml" xmlns:wpg="http://schemas.microsoft.com/office/word/2010/wordprocessingGroup" xmlns:wpi="http://schemas.microsoft.com/office/word/2010/wordprocessingInk" xmlns:wne="http://schemas.microsoft.com/office/word/2006/wordml" xmlns:wps="http://schemas.microsoft.com/office/word/2010/wordprocessingShape" mc:Ignorable="w14 w15 wp14">
+  <w:p>
+    <w:pPr>
+      <w:pStyle w:val="Header"/>
+    </w:pPr>
+  </w:p>
+</w:hdr>
+</file>
+
+<file path=word/header2.xml><?xml version="1.0" encoding="utf-8"?>
+<w:hdr xmlns:wpc="http://schemas.microsoft.com/office/word/2010/wordprocessingCanvas" xmlns:mc="http://schemas.openxmlformats.org/markup-compatibility/2006" xmlns:o="urn:schemas-microsoft-com:office:office" xmlns:r="http://schemas.openxmlformats.org/officeDocument/2006/relationships" xmlns:m="http://schemas.openxmlformats.org/officeDocument/2006/math" xmlns:v="urn:schemas-microsoft-com:vml" xmlns:wp14="http://schemas.microsoft.com/office/word/2010/wordprocessingDrawing" xmlns:wp="http://schemas.openxmlformats.org/drawingml/2006/wordprocessingDrawing" xmlns:w10="urn:schemas-microsoft-com:office:word" xmlns:w="http://schemas.openxmlformats.org/wordprocessingml/2006/main" xmlns:w14="http://schemas.microsoft.com/office/word/2010/wordml" xmlns:w15="http://schemas.microsoft.com/office/word/2012/wordml" xmlns:wpg="http://schemas.microsoft.com/office/word/2010/wordprocessingGroup" xmlns:wpi="http://schemas.microsoft.com/office/word/2010/wordprocessingInk" xmlns:wne="http://schemas.microsoft.com/office/word/2006/wordml" xmlns:wps="http://schemas.microsoft.com/office/word/2010/wordprocessingShape" mc:Ignorable="w14 w15 wp14">
+  <w:p>
+    <w:pPr>
+      <w:pStyle w:val="Header"/>
+    </w:pPr>
+  </w:p>
+</w:hdr>
+</file>
+
+<file path=word/header3.xml><?xml version="1.0" encoding="utf-8"?>
 <w:hdr xmlns:wpc="http://schemas.microsoft.com/office/word/2010/wordprocessingCanvas" xmlns:mc="http://schemas.openxmlformats.org/markup-compatibility/2006" xmlns:o="urn:schemas-microsoft-com:office:office" xmlns:r="http://schemas.openxmlformats.org/officeDocument/2006/relationships" xmlns:m="http://schemas.openxmlformats.org/officeDocument/2006/math" xmlns:v="urn:schemas-microsoft-com:vml" xmlns:wp14="http://schemas.microsoft.com/office/word/2010/wordprocessingDrawing" xmlns:wp="http://schemas.openxmlformats.org/drawingml/2006/wordprocessingDrawing" xmlns:w10="urn:schemas-microsoft-com:office:word" xmlns:w="http://schemas.openxmlformats.org/wordprocessingml/2006/main" xmlns:w14="http://schemas.microsoft.com/office/word/2010/wordml" xmlns:w15="http://schemas.microsoft.com/office/word/2012/wordml" xmlns:wpg="http://schemas.microsoft.com/office/word/2010/wordprocessingGroup" xmlns:wpi="http://schemas.microsoft.com/office/word/2010/wordprocessingInk" xmlns:wne="http://schemas.microsoft.com/office/word/2006/wordml" xmlns:wps="http://schemas.microsoft.com/office/word/2010/wordprocessingShape" mc:Ignorable="w14 w15 wp14">
   <w:p>
     <w:pPr>
@@ -12497,7 +11933,7 @@
 </w:hdr>
 </file>
 
-<file path=word/header2.xml><?xml version="1.0" encoding="utf-8"?>
+<file path=word/header4.xml><?xml version="1.0" encoding="utf-8"?>
 <w:hdr xmlns:wpc="http://schemas.microsoft.com/office/word/2010/wordprocessingCanvas" xmlns:mc="http://schemas.openxmlformats.org/markup-compatibility/2006" xmlns:o="urn:schemas-microsoft-com:office:office" xmlns:r="http://schemas.openxmlformats.org/officeDocument/2006/relationships" xmlns:m="http://schemas.openxmlformats.org/officeDocument/2006/math" xmlns:v="urn:schemas-microsoft-com:vml" xmlns:wp14="http://schemas.microsoft.com/office/word/2010/wordprocessingDrawing" xmlns:wp="http://schemas.openxmlformats.org/drawingml/2006/wordprocessingDrawing" xmlns:w10="urn:schemas-microsoft-com:office:word" xmlns:w="http://schemas.openxmlformats.org/wordprocessingml/2006/main" xmlns:w14="http://schemas.microsoft.com/office/word/2010/wordml" xmlns:w15="http://schemas.microsoft.com/office/word/2012/wordml" xmlns:wpg="http://schemas.microsoft.com/office/word/2010/wordprocessingGroup" xmlns:wpi="http://schemas.microsoft.com/office/word/2010/wordprocessingInk" xmlns:wne="http://schemas.microsoft.com/office/word/2006/wordml" xmlns:wps="http://schemas.microsoft.com/office/word/2010/wordprocessingShape" mc:Ignorable="w14 w15 wp14">
   <w:p>
     <w:pPr>
@@ -12506,29 +11942,6 @@
     <w:r>
       <w:t>9-tap tour</w:t>
     </w:r>
-  </w:p>
-</w:hdr>
-</file>
-
-<file path=word/header3.xml><?xml version="1.0" encoding="utf-8"?>
-<w:hdr xmlns:wpc="http://schemas.microsoft.com/office/word/2010/wordprocessingCanvas" xmlns:mc="http://schemas.openxmlformats.org/markup-compatibility/2006" xmlns:o="urn:schemas-microsoft-com:office:office" xmlns:r="http://schemas.openxmlformats.org/officeDocument/2006/relationships" xmlns:m="http://schemas.openxmlformats.org/officeDocument/2006/math" xmlns:v="urn:schemas-microsoft-com:vml" xmlns:wp14="http://schemas.microsoft.com/office/word/2010/wordprocessingDrawing" xmlns:wp="http://schemas.openxmlformats.org/drawingml/2006/wordprocessingDrawing" xmlns:w10="urn:schemas-microsoft-com:office:word" xmlns:w="http://schemas.openxmlformats.org/wordprocessingml/2006/main" xmlns:w14="http://schemas.microsoft.com/office/word/2010/wordml" xmlns:w15="http://schemas.microsoft.com/office/word/2012/wordml" xmlns:wpg="http://schemas.microsoft.com/office/word/2010/wordprocessingGroup" xmlns:wpi="http://schemas.microsoft.com/office/word/2010/wordprocessingInk" xmlns:wne="http://schemas.microsoft.com/office/word/2006/wordml" xmlns:wps="http://schemas.microsoft.com/office/word/2010/wordprocessingShape" mc:Ignorable="w14 w15 wp14">
-  <w:p>
-    <w:pPr>
-      <w:pStyle w:val="Header"/>
-    </w:pPr>
-    <w:r>
-      <w:t>9 Tap Tour</w:t>
-    </w:r>
-  </w:p>
-</w:hdr>
-</file>
-
-<file path=word/header4.xml><?xml version="1.0" encoding="utf-8"?>
-<w:hdr xmlns:wpc="http://schemas.microsoft.com/office/word/2010/wordprocessingCanvas" xmlns:mc="http://schemas.openxmlformats.org/markup-compatibility/2006" xmlns:o="urn:schemas-microsoft-com:office:office" xmlns:r="http://schemas.openxmlformats.org/officeDocument/2006/relationships" xmlns:m="http://schemas.openxmlformats.org/officeDocument/2006/math" xmlns:v="urn:schemas-microsoft-com:vml" xmlns:wp14="http://schemas.microsoft.com/office/word/2010/wordprocessingDrawing" xmlns:wp="http://schemas.openxmlformats.org/drawingml/2006/wordprocessingDrawing" xmlns:w10="urn:schemas-microsoft-com:office:word" xmlns:w="http://schemas.openxmlformats.org/wordprocessingml/2006/main" xmlns:w14="http://schemas.microsoft.com/office/word/2010/wordml" xmlns:w15="http://schemas.microsoft.com/office/word/2012/wordml" xmlns:wpg="http://schemas.microsoft.com/office/word/2010/wordprocessingGroup" xmlns:wpi="http://schemas.microsoft.com/office/word/2010/wordprocessingInk" xmlns:wne="http://schemas.microsoft.com/office/word/2006/wordml" xmlns:wps="http://schemas.microsoft.com/office/word/2010/wordprocessingShape" mc:Ignorable="w14 w15 wp14">
-  <w:p>
-    <w:pPr>
-      <w:pStyle w:val="Header"/>
-    </w:pPr>
   </w:p>
 </w:hdr>
 </file>
@@ -12547,6 +11960,29 @@
 </file>
 
 <file path=word/header6.xml><?xml version="1.0" encoding="utf-8"?>
+<w:hdr xmlns:wpc="http://schemas.microsoft.com/office/word/2010/wordprocessingCanvas" xmlns:mc="http://schemas.openxmlformats.org/markup-compatibility/2006" xmlns:o="urn:schemas-microsoft-com:office:office" xmlns:r="http://schemas.openxmlformats.org/officeDocument/2006/relationships" xmlns:m="http://schemas.openxmlformats.org/officeDocument/2006/math" xmlns:v="urn:schemas-microsoft-com:vml" xmlns:wp14="http://schemas.microsoft.com/office/word/2010/wordprocessingDrawing" xmlns:wp="http://schemas.openxmlformats.org/drawingml/2006/wordprocessingDrawing" xmlns:w10="urn:schemas-microsoft-com:office:word" xmlns:w="http://schemas.openxmlformats.org/wordprocessingml/2006/main" xmlns:w14="http://schemas.microsoft.com/office/word/2010/wordml" xmlns:w15="http://schemas.microsoft.com/office/word/2012/wordml" xmlns:wpg="http://schemas.microsoft.com/office/word/2010/wordprocessingGroup" xmlns:wpi="http://schemas.microsoft.com/office/word/2010/wordprocessingInk" xmlns:wne="http://schemas.microsoft.com/office/word/2006/wordml" xmlns:wps="http://schemas.microsoft.com/office/word/2010/wordprocessingShape" mc:Ignorable="w14 w15 wp14">
+  <w:p>
+    <w:pPr>
+      <w:pStyle w:val="Header"/>
+    </w:pPr>
+  </w:p>
+</w:hdr>
+</file>
+
+<file path=word/header7.xml><?xml version="1.0" encoding="utf-8"?>
+<w:hdr xmlns:wpc="http://schemas.microsoft.com/office/word/2010/wordprocessingCanvas" xmlns:mc="http://schemas.openxmlformats.org/markup-compatibility/2006" xmlns:o="urn:schemas-microsoft-com:office:office" xmlns:r="http://schemas.openxmlformats.org/officeDocument/2006/relationships" xmlns:m="http://schemas.openxmlformats.org/officeDocument/2006/math" xmlns:v="urn:schemas-microsoft-com:vml" xmlns:wp14="http://schemas.microsoft.com/office/word/2010/wordprocessingDrawing" xmlns:wp="http://schemas.openxmlformats.org/drawingml/2006/wordprocessingDrawing" xmlns:w10="urn:schemas-microsoft-com:office:word" xmlns:w="http://schemas.openxmlformats.org/wordprocessingml/2006/main" xmlns:w14="http://schemas.microsoft.com/office/word/2010/wordml" xmlns:w15="http://schemas.microsoft.com/office/word/2012/wordml" xmlns:wpg="http://schemas.microsoft.com/office/word/2010/wordprocessingGroup" xmlns:wpi="http://schemas.microsoft.com/office/word/2010/wordprocessingInk" xmlns:wne="http://schemas.microsoft.com/office/word/2006/wordml" xmlns:wps="http://schemas.microsoft.com/office/word/2010/wordprocessingShape" mc:Ignorable="w14 w15 wp14">
+  <w:p>
+    <w:pPr>
+      <w:pStyle w:val="Header"/>
+    </w:pPr>
+    <w:r>
+      <w:t>9 Tap Tour</w:t>
+    </w:r>
+  </w:p>
+</w:hdr>
+</file>
+
+<file path=word/header8.xml><?xml version="1.0" encoding="utf-8"?>
 <w:hdr xmlns:wpc="http://schemas.microsoft.com/office/word/2010/wordprocessingCanvas" xmlns:mc="http://schemas.openxmlformats.org/markup-compatibility/2006" xmlns:o="urn:schemas-microsoft-com:office:office" xmlns:r="http://schemas.openxmlformats.org/officeDocument/2006/relationships" xmlns:m="http://schemas.openxmlformats.org/officeDocument/2006/math" xmlns:v="urn:schemas-microsoft-com:vml" xmlns:wp14="http://schemas.microsoft.com/office/word/2010/wordprocessingDrawing" xmlns:wp="http://schemas.openxmlformats.org/drawingml/2006/wordprocessingDrawing" xmlns:w10="urn:schemas-microsoft-com:office:word" xmlns:w="http://schemas.openxmlformats.org/wordprocessingml/2006/main" xmlns:w14="http://schemas.microsoft.com/office/word/2010/wordml" xmlns:w15="http://schemas.microsoft.com/office/word/2012/wordml" xmlns:wpg="http://schemas.microsoft.com/office/word/2010/wordprocessingGroup" xmlns:wpi="http://schemas.microsoft.com/office/word/2010/wordprocessingInk" xmlns:wne="http://schemas.microsoft.com/office/word/2006/wordml" xmlns:wps="http://schemas.microsoft.com/office/word/2010/wordprocessingShape" mc:Ignorable="w14 w15 wp14">
   <w:p>
     <w:pPr>
@@ -16847,7 +16283,7 @@
 </file>
 
 <file path=customXml/itemProps1.xml><?xml version="1.0" encoding="utf-8"?>
-<ds:datastoreItem xmlns:ds="http://schemas.openxmlformats.org/officeDocument/2006/customXml" ds:itemID="{7534B3F8-13B8-45B6-B00B-E611EF13344C}">
+<ds:datastoreItem xmlns:ds="http://schemas.openxmlformats.org/officeDocument/2006/customXml" ds:itemID="{0021972A-0059-4275-B9F8-356AAD6661FA}">
   <ds:schemaRefs>
     <ds:schemaRef ds:uri="http://schemas.openxmlformats.org/officeDocument/2006/bibliography"/>
   </ds:schemaRefs>

</xml_diff>